<commit_message>
Actualiza INFORME.md con datos del estudiante y evidencias finales
</commit_message>
<xml_diff>
--- a/U1.S6.EXAMEN DE UNIDAD_PRACTICO_ANAMPA.docx
+++ b/U1.S6.EXAMEN DE UNIDAD_PRACTICO_ANAMPA.docx
@@ -293,7 +293,25 @@
             <w:sz w:val="24"/>
             <w:szCs w:val="24"/>
           </w:rPr>
-          <w:t>https://github.com/David-Anampa/si084_caso_coopac_examen_u1_David_Anampa.git</w:t>
+          <w:t>https://github.com/David-Anampa/si084_caso_coopac_exam</w:t>
+        </w:r>
+        <w:bookmarkStart w:id="0" w:name="_GoBack"/>
+        <w:bookmarkEnd w:id="0"/>
+        <w:r>
+          <w:rPr>
+            <w:rStyle w:val="Hipervnculo"/>
+            <w:sz w:val="24"/>
+            <w:szCs w:val="24"/>
+          </w:rPr>
+          <w:t>e</w:t>
+        </w:r>
+        <w:r>
+          <w:rPr>
+            <w:rStyle w:val="Hipervnculo"/>
+            <w:sz w:val="24"/>
+            <w:szCs w:val="24"/>
+          </w:rPr>
+          <w:t>n_u1_David_Anampa.git</w:t>
         </w:r>
       </w:hyperlink>
       <w:r>
@@ -500,7 +518,7 @@
           <w:color w:val="000000" w:themeColor="text1"/>
         </w:rPr>
       </w:pPr>
-      <w:bookmarkStart w:id="0" w:name="X898cffd599d862f536333f7ffa086e37523bc6e"/>
+      <w:bookmarkStart w:id="1" w:name="X898cffd599d862f536333f7ffa086e37523bc6e"/>
       <w:r>
         <w:rPr>
           <w:color w:val="000000" w:themeColor="text1"/>
@@ -687,8 +705,8 @@
       <w:pPr>
         <w:pStyle w:val="Ttulo2"/>
       </w:pPr>
-      <w:bookmarkStart w:id="1" w:name="qué-necesitas"/>
-      <w:bookmarkEnd w:id="0"/>
+      <w:bookmarkStart w:id="2" w:name="qué-necesitas"/>
+      <w:bookmarkEnd w:id="1"/>
       <w:r>
         <w:t>Qué necesitas</w:t>
       </w:r>
@@ -1053,8 +1071,8 @@
           <w:color w:val="000000" w:themeColor="text1"/>
         </w:rPr>
       </w:pPr>
-      <w:bookmarkStart w:id="2" w:name="el-caso"/>
-      <w:bookmarkEnd w:id="1"/>
+      <w:bookmarkStart w:id="3" w:name="el-caso"/>
+      <w:bookmarkEnd w:id="2"/>
       <w:r>
         <w:rPr>
           <w:color w:val="000000" w:themeColor="text1"/>
@@ -1067,7 +1085,7 @@
         <w:pStyle w:val="Textoindependiente"/>
       </w:pPr>
     </w:p>
-    <w:bookmarkEnd w:id="2"/>
+    <w:bookmarkEnd w:id="3"/>
     <w:p>
       <w:pPr>
         <w:pStyle w:val="FirstParagraph"/>
@@ -1366,7 +1384,7 @@
       <w:pPr>
         <w:pStyle w:val="Ttulo2"/>
       </w:pPr>
-      <w:bookmarkStart w:id="3" w:name="paso-1-levanta-el-servidor"/>
+      <w:bookmarkStart w:id="4" w:name="paso-1-levanta-el-servidor"/>
       <w:r>
         <w:t>Paso 1 · Levanta el servidor</w:t>
       </w:r>
@@ -1826,8 +1844,8 @@
       <w:pPr>
         <w:pStyle w:val="Ttulo2"/>
       </w:pPr>
-      <w:bookmarkStart w:id="4" w:name="paso-2-ejecuta-los-siete-procedimientos"/>
-      <w:bookmarkEnd w:id="3"/>
+      <w:bookmarkStart w:id="5" w:name="paso-2-ejecuta-los-siete-procedimientos"/>
+      <w:bookmarkEnd w:id="4"/>
       <w:r>
         <w:t>Paso 2 · Ejecuta los siete procedimientos</w:t>
       </w:r>
@@ -1879,7 +1897,7 @@
       <w:pPr>
         <w:pStyle w:val="Ttulo3"/>
       </w:pPr>
-      <w:bookmarkStart w:id="5" w:name="X0fc94e58260a3c5fa0a6000ef14fc7f3eb8a8c0"/>
+      <w:bookmarkStart w:id="6" w:name="X0fc94e58260a3c5fa0a6000ef14fc7f3eb8a8c0"/>
       <w:r>
         <w:t>P1 · Regla R1 · Exposición de la base de datos</w:t>
       </w:r>
@@ -2041,8 +2059,8 @@
       <w:pPr>
         <w:pStyle w:val="Ttulo3"/>
       </w:pPr>
-      <w:bookmarkStart w:id="6" w:name="p2-regla-r2-contraseñas"/>
-      <w:bookmarkEnd w:id="5"/>
+      <w:bookmarkStart w:id="7" w:name="p2-regla-r2-contraseñas"/>
+      <w:bookmarkEnd w:id="6"/>
       <w:r>
         <w:t>P2 · Regla R2 · Contraseñas</w:t>
       </w:r>
@@ -2193,8 +2211,8 @@
       <w:pPr>
         <w:pStyle w:val="Ttulo3"/>
       </w:pPr>
-      <w:bookmarkStart w:id="7" w:name="Xc7047a854d9b5489b2f162f46aa1fa1e3c9e755"/>
-      <w:bookmarkEnd w:id="6"/>
+      <w:bookmarkStart w:id="8" w:name="Xc7047a854d9b5489b2f162f46aa1fa1e3c9e755"/>
+      <w:bookmarkEnd w:id="7"/>
       <w:r>
         <w:t xml:space="preserve">P3 · Regla R3 · Cuentas con privilegio de </w:t>
       </w:r>
@@ -2453,8 +2471,8 @@
       <w:pPr>
         <w:pStyle w:val="Ttulo3"/>
       </w:pPr>
-      <w:bookmarkStart w:id="8" w:name="X0b7c0daf2ba7ecf6bf6242ebca5aad2668d0558"/>
-      <w:bookmarkEnd w:id="7"/>
+      <w:bookmarkStart w:id="9" w:name="X0b7c0daf2ba7ecf6bf6242ebca5aad2668d0558"/>
+      <w:bookmarkEnd w:id="8"/>
       <w:r>
         <w:t>P4 · Regla R4 · Cuentas de personas cesadas y cuentas sin responsable</w:t>
       </w:r>
@@ -3022,8 +3040,8 @@
       <w:pPr>
         <w:pStyle w:val="Ttulo3"/>
       </w:pPr>
-      <w:bookmarkStart w:id="9" w:name="X2f617f39cf3bc529def7b6ffcc6fcda771b3464"/>
-      <w:bookmarkEnd w:id="8"/>
+      <w:bookmarkStart w:id="10" w:name="X2f617f39cf3bc529def7b6ffcc6fcda771b3464"/>
+      <w:bookmarkEnd w:id="9"/>
       <w:r>
         <w:t>P5 · Regla R5 · Segregación de funciones en los desembolsos</w:t>
       </w:r>
@@ -3598,8 +3616,8 @@
       <w:pPr>
         <w:pStyle w:val="Ttulo3"/>
       </w:pPr>
-      <w:bookmarkStart w:id="10" w:name="X334b5b94bbb8ed0af40179b6d1144ff312dd77c"/>
-      <w:bookmarkEnd w:id="9"/>
+      <w:bookmarkStart w:id="11" w:name="X334b5b94bbb8ed0af40179b6d1144ff312dd77c"/>
+      <w:bookmarkEnd w:id="10"/>
       <w:r>
         <w:t>P6 · Regla R6 · Registro de conexiones y modificaciones</w:t>
       </w:r>
@@ -3934,8 +3952,8 @@
       <w:pPr>
         <w:pStyle w:val="Ttulo3"/>
       </w:pPr>
-      <w:bookmarkStart w:id="11" w:name="X1b21f347adcff730c95450703f28dd855e55d43"/>
-      <w:bookmarkEnd w:id="10"/>
+      <w:bookmarkStart w:id="12" w:name="X1b21f347adcff730c95450703f28dd855e55d43"/>
+      <w:bookmarkEnd w:id="11"/>
       <w:r>
         <w:t>P7 · Regla R7 · Respaldo y prueba de restauración</w:t>
       </w:r>
@@ -4768,9 +4786,9 @@
       <w:pPr>
         <w:pStyle w:val="Ttulo2"/>
       </w:pPr>
-      <w:bookmarkStart w:id="12" w:name="paso-3-redacta-dos-hallazgos"/>
-      <w:bookmarkEnd w:id="4"/>
-      <w:bookmarkEnd w:id="11"/>
+      <w:bookmarkStart w:id="13" w:name="paso-3-redacta-dos-hallazgos"/>
+      <w:bookmarkEnd w:id="5"/>
+      <w:bookmarkEnd w:id="12"/>
       <w:r>
         <w:t>Paso 3 · Redacta dos hallazgos</w:t>
       </w:r>
@@ -5034,8 +5052,8 @@
       <w:pPr>
         <w:pStyle w:val="Ttulo2"/>
       </w:pPr>
-      <w:bookmarkStart w:id="13" w:name="paso-4-sube-tu-evidencia-a-github"/>
-      <w:bookmarkEnd w:id="12"/>
+      <w:bookmarkStart w:id="14" w:name="paso-4-sube-tu-evidencia-a-github"/>
+      <w:bookmarkEnd w:id="13"/>
       <w:r>
         <w:lastRenderedPageBreak/>
         <w:drawing>
@@ -5074,8 +5092,6 @@
           </wp:inline>
         </w:drawing>
       </w:r>
-      <w:bookmarkStart w:id="14" w:name="_GoBack"/>
-      <w:bookmarkEnd w:id="14"/>
     </w:p>
     <w:p>
       <w:pPr>
@@ -5179,6 +5195,9 @@
     <w:p>
       <w:pPr>
         <w:pStyle w:val="SourceCode"/>
+        <w:rPr>
+          <w:rStyle w:val="NormalTok"/>
+        </w:rPr>
       </w:pPr>
       <w:r>
         <w:rPr>
@@ -5576,6 +5595,176 @@
     </w:p>
     <w:p>
       <w:pPr>
+        <w:pStyle w:val="SourceCode"/>
+      </w:pPr>
+      <w:r>
+        <w:lastRenderedPageBreak/>
+        <w:drawing>
+          <wp:inline distT="0" distB="0" distL="0" distR="0" wp14:anchorId="73D1B9C0" wp14:editId="144146A7">
+            <wp:extent cx="5939790" cy="4436110"/>
+            <wp:effectExtent l="0" t="0" r="0" b="0"/>
+            <wp:docPr id="17" name="Imagen 17"/>
+            <wp:cNvGraphicFramePr>
+              <a:graphicFrameLocks xmlns:a="http://schemas.openxmlformats.org/drawingml/2006/main" noChangeAspect="1"/>
+            </wp:cNvGraphicFramePr>
+            <a:graphic xmlns:a="http://schemas.openxmlformats.org/drawingml/2006/main">
+              <a:graphicData uri="http://schemas.openxmlformats.org/drawingml/2006/picture">
+                <pic:pic xmlns:pic="http://schemas.openxmlformats.org/drawingml/2006/picture">
+                  <pic:nvPicPr>
+                    <pic:cNvPr id="1" name=""/>
+                    <pic:cNvPicPr/>
+                  </pic:nvPicPr>
+                  <pic:blipFill>
+                    <a:blip r:embed="rId26"/>
+                    <a:stretch>
+                      <a:fillRect/>
+                    </a:stretch>
+                  </pic:blipFill>
+                  <pic:spPr>
+                    <a:xfrm>
+                      <a:off x="0" y="0"/>
+                      <a:ext cx="5939790" cy="4436110"/>
+                    </a:xfrm>
+                    <a:prstGeom prst="rect">
+                      <a:avLst/>
+                    </a:prstGeom>
+                  </pic:spPr>
+                </pic:pic>
+              </a:graphicData>
+            </a:graphic>
+          </wp:inline>
+        </w:drawing>
+      </w:r>
+    </w:p>
+    <w:p>
+      <w:pPr>
+        <w:pStyle w:val="SourceCode"/>
+      </w:pPr>
+      <w:r>
+        <w:drawing>
+          <wp:inline distT="0" distB="0" distL="0" distR="0" wp14:anchorId="48A9E27A" wp14:editId="64B458EC">
+            <wp:extent cx="5939790" cy="2841625"/>
+            <wp:effectExtent l="0" t="0" r="0" b="0"/>
+            <wp:docPr id="18" name="Imagen 18"/>
+            <wp:cNvGraphicFramePr>
+              <a:graphicFrameLocks xmlns:a="http://schemas.openxmlformats.org/drawingml/2006/main" noChangeAspect="1"/>
+            </wp:cNvGraphicFramePr>
+            <a:graphic xmlns:a="http://schemas.openxmlformats.org/drawingml/2006/main">
+              <a:graphicData uri="http://schemas.openxmlformats.org/drawingml/2006/picture">
+                <pic:pic xmlns:pic="http://schemas.openxmlformats.org/drawingml/2006/picture">
+                  <pic:nvPicPr>
+                    <pic:cNvPr id="1" name=""/>
+                    <pic:cNvPicPr/>
+                  </pic:nvPicPr>
+                  <pic:blipFill>
+                    <a:blip r:embed="rId27"/>
+                    <a:stretch>
+                      <a:fillRect/>
+                    </a:stretch>
+                  </pic:blipFill>
+                  <pic:spPr>
+                    <a:xfrm>
+                      <a:off x="0" y="0"/>
+                      <a:ext cx="5939790" cy="2841625"/>
+                    </a:xfrm>
+                    <a:prstGeom prst="rect">
+                      <a:avLst/>
+                    </a:prstGeom>
+                  </pic:spPr>
+                </pic:pic>
+              </a:graphicData>
+            </a:graphic>
+          </wp:inline>
+        </w:drawing>
+      </w:r>
+    </w:p>
+    <w:p>
+      <w:pPr>
+        <w:pStyle w:val="SourceCode"/>
+      </w:pPr>
+      <w:r>
+        <w:lastRenderedPageBreak/>
+        <w:drawing>
+          <wp:inline distT="0" distB="0" distL="0" distR="0" wp14:anchorId="005CFBB7" wp14:editId="42D3B3B7">
+            <wp:extent cx="5939790" cy="1251585"/>
+            <wp:effectExtent l="0" t="0" r="0" b="0"/>
+            <wp:docPr id="19" name="Imagen 19"/>
+            <wp:cNvGraphicFramePr>
+              <a:graphicFrameLocks xmlns:a="http://schemas.openxmlformats.org/drawingml/2006/main" noChangeAspect="1"/>
+            </wp:cNvGraphicFramePr>
+            <a:graphic xmlns:a="http://schemas.openxmlformats.org/drawingml/2006/main">
+              <a:graphicData uri="http://schemas.openxmlformats.org/drawingml/2006/picture">
+                <pic:pic xmlns:pic="http://schemas.openxmlformats.org/drawingml/2006/picture">
+                  <pic:nvPicPr>
+                    <pic:cNvPr id="1" name=""/>
+                    <pic:cNvPicPr/>
+                  </pic:nvPicPr>
+                  <pic:blipFill>
+                    <a:blip r:embed="rId28"/>
+                    <a:stretch>
+                      <a:fillRect/>
+                    </a:stretch>
+                  </pic:blipFill>
+                  <pic:spPr>
+                    <a:xfrm>
+                      <a:off x="0" y="0"/>
+                      <a:ext cx="5939790" cy="1251585"/>
+                    </a:xfrm>
+                    <a:prstGeom prst="rect">
+                      <a:avLst/>
+                    </a:prstGeom>
+                  </pic:spPr>
+                </pic:pic>
+              </a:graphicData>
+            </a:graphic>
+          </wp:inline>
+        </w:drawing>
+      </w:r>
+    </w:p>
+    <w:p>
+      <w:pPr>
+        <w:pStyle w:val="SourceCode"/>
+      </w:pPr>
+      <w:r>
+        <w:drawing>
+          <wp:inline distT="0" distB="0" distL="0" distR="0" wp14:anchorId="12BBF79F" wp14:editId="288C364A">
+            <wp:extent cx="5939790" cy="1673225"/>
+            <wp:effectExtent l="0" t="0" r="0" b="0"/>
+            <wp:docPr id="20" name="Imagen 20"/>
+            <wp:cNvGraphicFramePr>
+              <a:graphicFrameLocks xmlns:a="http://schemas.openxmlformats.org/drawingml/2006/main" noChangeAspect="1"/>
+            </wp:cNvGraphicFramePr>
+            <a:graphic xmlns:a="http://schemas.openxmlformats.org/drawingml/2006/main">
+              <a:graphicData uri="http://schemas.openxmlformats.org/drawingml/2006/picture">
+                <pic:pic xmlns:pic="http://schemas.openxmlformats.org/drawingml/2006/picture">
+                  <pic:nvPicPr>
+                    <pic:cNvPr id="1" name=""/>
+                    <pic:cNvPicPr/>
+                  </pic:nvPicPr>
+                  <pic:blipFill>
+                    <a:blip r:embed="rId29"/>
+                    <a:stretch>
+                      <a:fillRect/>
+                    </a:stretch>
+                  </pic:blipFill>
+                  <pic:spPr>
+                    <a:xfrm>
+                      <a:off x="0" y="0"/>
+                      <a:ext cx="5939790" cy="1673225"/>
+                    </a:xfrm>
+                    <a:prstGeom prst="rect">
+                      <a:avLst/>
+                    </a:prstGeom>
+                  </pic:spPr>
+                </pic:pic>
+              </a:graphicData>
+            </a:graphic>
+          </wp:inline>
+        </w:drawing>
+      </w:r>
+    </w:p>
+    <w:p>
+      <w:pPr>
         <w:pStyle w:val="FirstParagraph"/>
       </w:pPr>
       <w:r>
@@ -5613,7 +5802,7 @@
         <w:pStyle w:val="Ttulo2"/>
       </w:pPr>
       <w:bookmarkStart w:id="15" w:name="paso-5-entrega-el-informe"/>
-      <w:bookmarkEnd w:id="13"/>
+      <w:bookmarkEnd w:id="14"/>
       <w:r>
         <w:t>Paso 5 · Entrega el informe</w:t>
       </w:r>
@@ -5948,7 +6137,6 @@
           <w:b/>
           <w:bCs/>
         </w:rPr>
-        <w:lastRenderedPageBreak/>
         <w:t>El informe es lo que se califica; el repositorio es lo que lo prueba.</w:t>
       </w:r>
       <w:r>
@@ -6121,6 +6309,7 @@
               <w:pStyle w:val="Compact"/>
             </w:pPr>
             <w:r>
+              <w:lastRenderedPageBreak/>
               <w:t>P7 · restauración ejecutada, tabla faltante y días sin respaldo</w:t>
             </w:r>
           </w:p>
@@ -6310,8 +6499,8 @@
       </w:pPr>
     </w:p>
     <w:sectPr>
-      <w:headerReference w:type="default" r:id="rId26"/>
-      <w:footerReference w:type="default" r:id="rId27"/>
+      <w:headerReference w:type="default" r:id="rId30"/>
+      <w:footerReference w:type="default" r:id="rId31"/>
       <w:footnotePr>
         <w:numRestart w:val="eachSect"/>
       </w:footnotePr>
@@ -9570,6 +9759,17 @@
       <w:contextualSpacing/>
     </w:pPr>
   </w:style>
+  <w:style w:type="character" w:styleId="Hipervnculovisitado">
+    <w:name w:val="FollowedHyperlink"/>
+    <w:basedOn w:val="Fuentedeprrafopredeter"/>
+    <w:semiHidden/>
+    <w:unhideWhenUsed/>
+    <w:rsid w:val="00A040C5"/>
+    <w:rPr>
+      <w:color w:val="96607D" w:themeColor="followedHyperlink"/>
+      <w:u w:val="single"/>
+    </w:rPr>
+  </w:style>
 </w:styles>
 </file>
 
@@ -9873,7 +10073,7 @@
 </file>
 
 <file path=customXml/itemProps1.xml><?xml version="1.0" encoding="utf-8"?>
-<ds:datastoreItem xmlns:ds="http://schemas.openxmlformats.org/officeDocument/2006/customXml" ds:itemID="{B58F5BDD-1153-4D32-A8B2-0CEE1D3D3965}">
+<ds:datastoreItem xmlns:ds="http://schemas.openxmlformats.org/officeDocument/2006/customXml" ds:itemID="{26D61E6F-177D-41F5-996E-C11F4A2AD018}">
   <ds:schemaRefs>
     <ds:schemaRef ds:uri="http://schemas.openxmlformats.org/officeDocument/2006/bibliography"/>
   </ds:schemaRefs>

</xml_diff>

<commit_message>
Agrega PDF del informe y actualiza docx
</commit_message>
<xml_diff>
--- a/U1.S6.EXAMEN DE UNIDAD_PRACTICO_ANAMPA.docx
+++ b/U1.S6.EXAMEN DE UNIDAD_PRACTICO_ANAMPA.docx
@@ -12,6 +12,8 @@
           <w:szCs w:val="30"/>
         </w:rPr>
       </w:pPr>
+      <w:bookmarkStart w:id="0" w:name="_GoBack"/>
+      <w:bookmarkEnd w:id="0"/>
     </w:p>
     <w:p>
       <w:pPr>
@@ -375,8 +377,6 @@
         </w:rPr>
         <w:t>DOCENTE:</w:t>
       </w:r>
-      <w:bookmarkStart w:id="0" w:name="_GoBack"/>
-      <w:bookmarkEnd w:id="0"/>
     </w:p>
     <w:p>
       <w:pPr>
@@ -1407,50 +1407,48 @@
     <w:p>
       <w:pPr>
         <w:pStyle w:val="Compact"/>
-        <w:numPr>
-          <w:ilvl w:val="0"/>
-          <w:numId w:val="7"/>
-        </w:numPr>
-      </w:pPr>
-      <w:r>
-        <w:t xml:space="preserve">Abre una terminal </w:t>
-      </w:r>
-      <w:proofErr w:type="spellStart"/>
-      <w:r>
-        <w:t>bash</w:t>
-      </w:r>
-      <w:proofErr w:type="spellEnd"/>
-      <w:r>
-        <w:t xml:space="preserve">. En Windows es </w:t>
-      </w:r>
-      <w:r>
-        <w:rPr>
-          <w:b/>
-          <w:bCs/>
-        </w:rPr>
-        <w:t xml:space="preserve">Git </w:t>
-      </w:r>
-      <w:proofErr w:type="spellStart"/>
-      <w:r>
-        <w:rPr>
-          <w:b/>
-          <w:bCs/>
-        </w:rPr>
-        <w:t>Bash</w:t>
-      </w:r>
-      <w:proofErr w:type="spellEnd"/>
-      <w:r>
-        <w:t xml:space="preserve">; en Linux y macOS, la </w:t>
-      </w:r>
-      <w:r>
-        <w:rPr>
-          <w:b/>
-          <w:bCs/>
-        </w:rPr>
-        <w:t>Terminal</w:t>
-      </w:r>
-      <w:r>
-        <w:t>.</w:t>
+        <w:ind w:left="720"/>
+        <w:jc w:val="center"/>
+      </w:pPr>
+      <w:r>
+        <w:rPr>
+          <w:noProof/>
+        </w:rPr>
+        <w:drawing>
+          <wp:inline distT="0" distB="0" distL="0" distR="0" wp14:anchorId="37C15D7A" wp14:editId="782B0427">
+            <wp:extent cx="2154803" cy="2893592"/>
+            <wp:effectExtent l="0" t="0" r="0" b="0"/>
+            <wp:docPr id="1" name="Imagen 1"/>
+            <wp:cNvGraphicFramePr>
+              <a:graphicFrameLocks xmlns:a="http://schemas.openxmlformats.org/drawingml/2006/main" noChangeAspect="1"/>
+            </wp:cNvGraphicFramePr>
+            <a:graphic xmlns:a="http://schemas.openxmlformats.org/drawingml/2006/main">
+              <a:graphicData uri="http://schemas.openxmlformats.org/drawingml/2006/picture">
+                <pic:pic xmlns:pic="http://schemas.openxmlformats.org/drawingml/2006/picture">
+                  <pic:nvPicPr>
+                    <pic:cNvPr id="1" name=""/>
+                    <pic:cNvPicPr/>
+                  </pic:nvPicPr>
+                  <pic:blipFill>
+                    <a:blip r:embed="rId10"/>
+                    <a:stretch>
+                      <a:fillRect/>
+                    </a:stretch>
+                  </pic:blipFill>
+                  <pic:spPr>
+                    <a:xfrm>
+                      <a:off x="0" y="0"/>
+                      <a:ext cx="2176973" cy="2923363"/>
+                    </a:xfrm>
+                    <a:prstGeom prst="rect">
+                      <a:avLst/>
+                    </a:prstGeom>
+                  </pic:spPr>
+                </pic:pic>
+              </a:graphicData>
+            </a:graphic>
+          </wp:inline>
+        </w:drawing>
       </w:r>
     </w:p>
     <w:p>
@@ -1462,6 +1460,55 @@
         </w:numPr>
       </w:pPr>
       <w:r>
+        <w:t xml:space="preserve">Abre una terminal </w:t>
+      </w:r>
+      <w:proofErr w:type="spellStart"/>
+      <w:r>
+        <w:t>bash</w:t>
+      </w:r>
+      <w:proofErr w:type="spellEnd"/>
+      <w:r>
+        <w:t xml:space="preserve">. En Windows es </w:t>
+      </w:r>
+      <w:r>
+        <w:rPr>
+          <w:b/>
+          <w:bCs/>
+        </w:rPr>
+        <w:t xml:space="preserve">Git </w:t>
+      </w:r>
+      <w:proofErr w:type="spellStart"/>
+      <w:r>
+        <w:rPr>
+          <w:b/>
+          <w:bCs/>
+        </w:rPr>
+        <w:t>Bash</w:t>
+      </w:r>
+      <w:proofErr w:type="spellEnd"/>
+      <w:r>
+        <w:t xml:space="preserve">; en Linux y macOS, la </w:t>
+      </w:r>
+      <w:r>
+        <w:rPr>
+          <w:b/>
+          <w:bCs/>
+        </w:rPr>
+        <w:t>Terminal</w:t>
+      </w:r>
+      <w:r>
+        <w:t>.</w:t>
+      </w:r>
+    </w:p>
+    <w:p>
+      <w:pPr>
+        <w:pStyle w:val="Compact"/>
+        <w:numPr>
+          <w:ilvl w:val="0"/>
+          <w:numId w:val="7"/>
+        </w:numPr>
+      </w:pPr>
+      <w:r>
         <w:t xml:space="preserve">Copia estas tres órdenes. La primera te lleva a Descargas, la segunda descomprime el paquete y crea la carpeta </w:t>
       </w:r>
       <w:r>
@@ -1477,6 +1524,9 @@
     <w:p>
       <w:pPr>
         <w:pStyle w:val="SourceCode"/>
+        <w:rPr>
+          <w:rStyle w:val="NormalTok"/>
+        </w:rPr>
       </w:pPr>
       <w:r>
         <w:rPr>
@@ -1529,6 +1579,52 @@
           <w:rStyle w:val="NormalTok"/>
         </w:rPr>
         <w:t xml:space="preserve"> si084-caso-coopac</w:t>
+      </w:r>
+    </w:p>
+    <w:p>
+      <w:pPr>
+        <w:pStyle w:val="SourceCode"/>
+        <w:jc w:val="center"/>
+      </w:pPr>
+      <w:r>
+        <w:rPr>
+          <w:noProof/>
+        </w:rPr>
+        <w:drawing>
+          <wp:inline distT="0" distB="0" distL="0" distR="0" wp14:anchorId="6A2FE3B2" wp14:editId="2AE0295D">
+            <wp:extent cx="4381168" cy="2042521"/>
+            <wp:effectExtent l="0" t="0" r="0" b="0"/>
+            <wp:docPr id="2" name="Imagen 2"/>
+            <wp:cNvGraphicFramePr>
+              <a:graphicFrameLocks xmlns:a="http://schemas.openxmlformats.org/drawingml/2006/main" noChangeAspect="1"/>
+            </wp:cNvGraphicFramePr>
+            <a:graphic xmlns:a="http://schemas.openxmlformats.org/drawingml/2006/main">
+              <a:graphicData uri="http://schemas.openxmlformats.org/drawingml/2006/picture">
+                <pic:pic xmlns:pic="http://schemas.openxmlformats.org/drawingml/2006/picture">
+                  <pic:nvPicPr>
+                    <pic:cNvPr id="1" name=""/>
+                    <pic:cNvPicPr/>
+                  </pic:nvPicPr>
+                  <pic:blipFill>
+                    <a:blip r:embed="rId11"/>
+                    <a:stretch>
+                      <a:fillRect/>
+                    </a:stretch>
+                  </pic:blipFill>
+                  <pic:spPr>
+                    <a:xfrm>
+                      <a:off x="0" y="0"/>
+                      <a:ext cx="4415005" cy="2058296"/>
+                    </a:xfrm>
+                    <a:prstGeom prst="rect">
+                      <a:avLst/>
+                    </a:prstGeom>
+                  </pic:spPr>
+                </pic:pic>
+              </a:graphicData>
+            </a:graphic>
+          </wp:inline>
+        </w:drawing>
       </w:r>
     </w:p>
     <w:p>
@@ -1557,6 +1653,9 @@
     <w:p>
       <w:pPr>
         <w:pStyle w:val="SourceCode"/>
+        <w:rPr>
+          <w:rStyle w:val="AttributeTok"/>
+        </w:rPr>
       </w:pPr>
       <w:proofErr w:type="spellStart"/>
       <w:r>
@@ -1602,7 +1701,7 @@
         <w:rPr>
           <w:rStyle w:val="AttributeTok"/>
         </w:rPr>
-        <w:t>--</w:t>
+        <w:t>–</w:t>
       </w:r>
       <w:proofErr w:type="spellStart"/>
       <w:r>
@@ -1612,6 +1711,53 @@
         <w:t>wait</w:t>
       </w:r>
       <w:proofErr w:type="spellEnd"/>
+    </w:p>
+    <w:p>
+      <w:pPr>
+        <w:pStyle w:val="SourceCode"/>
+        <w:jc w:val="center"/>
+      </w:pPr>
+      <w:r>
+        <w:rPr>
+          <w:noProof/>
+        </w:rPr>
+        <w:lastRenderedPageBreak/>
+        <w:drawing>
+          <wp:inline distT="0" distB="0" distL="0" distR="0" wp14:anchorId="0B045DF0" wp14:editId="391B9DEC">
+            <wp:extent cx="5939790" cy="1656080"/>
+            <wp:effectExtent l="0" t="0" r="0" b="0"/>
+            <wp:docPr id="3" name="Imagen 3"/>
+            <wp:cNvGraphicFramePr>
+              <a:graphicFrameLocks xmlns:a="http://schemas.openxmlformats.org/drawingml/2006/main" noChangeAspect="1"/>
+            </wp:cNvGraphicFramePr>
+            <a:graphic xmlns:a="http://schemas.openxmlformats.org/drawingml/2006/main">
+              <a:graphicData uri="http://schemas.openxmlformats.org/drawingml/2006/picture">
+                <pic:pic xmlns:pic="http://schemas.openxmlformats.org/drawingml/2006/picture">
+                  <pic:nvPicPr>
+                    <pic:cNvPr id="1" name=""/>
+                    <pic:cNvPicPr/>
+                  </pic:nvPicPr>
+                  <pic:blipFill>
+                    <a:blip r:embed="rId12"/>
+                    <a:stretch>
+                      <a:fillRect/>
+                    </a:stretch>
+                  </pic:blipFill>
+                  <pic:spPr>
+                    <a:xfrm>
+                      <a:off x="0" y="0"/>
+                      <a:ext cx="5939790" cy="1656080"/>
+                    </a:xfrm>
+                    <a:prstGeom prst="rect">
+                      <a:avLst/>
+                    </a:prstGeom>
+                  </pic:spPr>
+                </pic:pic>
+              </a:graphicData>
+            </a:graphic>
+          </wp:inline>
+        </w:drawing>
+      </w:r>
     </w:p>
     <w:p>
       <w:pPr>
@@ -1752,6 +1898,9 @@
     <w:p>
       <w:pPr>
         <w:pStyle w:val="SourceCode"/>
+        <w:rPr>
+          <w:rStyle w:val="NormalTok"/>
+        </w:rPr>
       </w:pPr>
       <w:proofErr w:type="spellStart"/>
       <w:r>
@@ -1820,6 +1969,51 @@
           <w:rStyle w:val="NormalTok"/>
         </w:rPr>
         <w:t xml:space="preserve"> evidencias/P1_puertos.txt</w:t>
+      </w:r>
+    </w:p>
+    <w:p>
+      <w:pPr>
+        <w:pStyle w:val="SourceCode"/>
+      </w:pPr>
+      <w:r>
+        <w:rPr>
+          <w:noProof/>
+        </w:rPr>
+        <w:drawing>
+          <wp:inline distT="0" distB="0" distL="0" distR="0" wp14:anchorId="4E80DDB8" wp14:editId="3380813A">
+            <wp:extent cx="5939790" cy="1918335"/>
+            <wp:effectExtent l="0" t="0" r="0" b="0"/>
+            <wp:docPr id="4" name="Imagen 4"/>
+            <wp:cNvGraphicFramePr>
+              <a:graphicFrameLocks xmlns:a="http://schemas.openxmlformats.org/drawingml/2006/main" noChangeAspect="1"/>
+            </wp:cNvGraphicFramePr>
+            <a:graphic xmlns:a="http://schemas.openxmlformats.org/drawingml/2006/main">
+              <a:graphicData uri="http://schemas.openxmlformats.org/drawingml/2006/picture">
+                <pic:pic xmlns:pic="http://schemas.openxmlformats.org/drawingml/2006/picture">
+                  <pic:nvPicPr>
+                    <pic:cNvPr id="1" name=""/>
+                    <pic:cNvPicPr/>
+                  </pic:nvPicPr>
+                  <pic:blipFill>
+                    <a:blip r:embed="rId13"/>
+                    <a:stretch>
+                      <a:fillRect/>
+                    </a:stretch>
+                  </pic:blipFill>
+                  <pic:spPr>
+                    <a:xfrm>
+                      <a:off x="0" y="0"/>
+                      <a:ext cx="5939790" cy="1918335"/>
+                    </a:xfrm>
+                    <a:prstGeom prst="rect">
+                      <a:avLst/>
+                    </a:prstGeom>
+                  </pic:spPr>
+                </pic:pic>
+              </a:graphicData>
+            </a:graphic>
+          </wp:inline>
+        </w:drawing>
       </w:r>
     </w:p>
     <w:p>
@@ -1870,6 +2064,9 @@
     <w:p>
       <w:pPr>
         <w:pStyle w:val="SourceCode"/>
+        <w:rPr>
+          <w:rStyle w:val="NormalTok"/>
+        </w:rPr>
       </w:pPr>
       <w:r>
         <w:rPr>
@@ -1946,6 +2143,52 @@
           <w:rStyle w:val="NormalTok"/>
         </w:rPr>
         <w:t xml:space="preserve"> evidencias/P2_credenciales.txt</w:t>
+      </w:r>
+    </w:p>
+    <w:p>
+      <w:pPr>
+        <w:pStyle w:val="SourceCode"/>
+      </w:pPr>
+      <w:r>
+        <w:rPr>
+          <w:noProof/>
+        </w:rPr>
+        <w:lastRenderedPageBreak/>
+        <w:drawing>
+          <wp:inline distT="0" distB="0" distL="0" distR="0" wp14:anchorId="01A783FF" wp14:editId="59EF67F8">
+            <wp:extent cx="5939790" cy="2388870"/>
+            <wp:effectExtent l="0" t="0" r="0" b="0"/>
+            <wp:docPr id="5" name="Imagen 5"/>
+            <wp:cNvGraphicFramePr>
+              <a:graphicFrameLocks xmlns:a="http://schemas.openxmlformats.org/drawingml/2006/main" noChangeAspect="1"/>
+            </wp:cNvGraphicFramePr>
+            <a:graphic xmlns:a="http://schemas.openxmlformats.org/drawingml/2006/main">
+              <a:graphicData uri="http://schemas.openxmlformats.org/drawingml/2006/picture">
+                <pic:pic xmlns:pic="http://schemas.openxmlformats.org/drawingml/2006/picture">
+                  <pic:nvPicPr>
+                    <pic:cNvPr id="1" name=""/>
+                    <pic:cNvPicPr/>
+                  </pic:nvPicPr>
+                  <pic:blipFill>
+                    <a:blip r:embed="rId14"/>
+                    <a:stretch>
+                      <a:fillRect/>
+                    </a:stretch>
+                  </pic:blipFill>
+                  <pic:spPr>
+                    <a:xfrm>
+                      <a:off x="0" y="0"/>
+                      <a:ext cx="5939790" cy="2388870"/>
+                    </a:xfrm>
+                    <a:prstGeom prst="rect">
+                      <a:avLst/>
+                    </a:prstGeom>
+                  </pic:spPr>
+                </pic:pic>
+              </a:graphicData>
+            </a:graphic>
+          </wp:inline>
+        </w:drawing>
       </w:r>
     </w:p>
     <w:p>
@@ -1981,6 +2224,9 @@
     <w:p>
       <w:pPr>
         <w:pStyle w:val="SourceCode"/>
+        <w:rPr>
+          <w:rStyle w:val="NormalTok"/>
+        </w:rPr>
       </w:pPr>
       <w:proofErr w:type="spellStart"/>
       <w:r>
@@ -2139,6 +2385,51 @@
           <w:rStyle w:val="NormalTok"/>
         </w:rPr>
         <w:t xml:space="preserve"> evidencias/P3_roles.txt</w:t>
+      </w:r>
+    </w:p>
+    <w:p>
+      <w:pPr>
+        <w:pStyle w:val="SourceCode"/>
+      </w:pPr>
+      <w:r>
+        <w:rPr>
+          <w:noProof/>
+        </w:rPr>
+        <w:drawing>
+          <wp:inline distT="0" distB="0" distL="0" distR="0" wp14:anchorId="1A0E69FC" wp14:editId="6A75B7E2">
+            <wp:extent cx="5939790" cy="1916430"/>
+            <wp:effectExtent l="0" t="0" r="0" b="0"/>
+            <wp:docPr id="6" name="Imagen 6"/>
+            <wp:cNvGraphicFramePr>
+              <a:graphicFrameLocks xmlns:a="http://schemas.openxmlformats.org/drawingml/2006/main" noChangeAspect="1"/>
+            </wp:cNvGraphicFramePr>
+            <a:graphic xmlns:a="http://schemas.openxmlformats.org/drawingml/2006/main">
+              <a:graphicData uri="http://schemas.openxmlformats.org/drawingml/2006/picture">
+                <pic:pic xmlns:pic="http://schemas.openxmlformats.org/drawingml/2006/picture">
+                  <pic:nvPicPr>
+                    <pic:cNvPr id="1" name=""/>
+                    <pic:cNvPicPr/>
+                  </pic:nvPicPr>
+                  <pic:blipFill>
+                    <a:blip r:embed="rId15"/>
+                    <a:stretch>
+                      <a:fillRect/>
+                    </a:stretch>
+                  </pic:blipFill>
+                  <pic:spPr>
+                    <a:xfrm>
+                      <a:off x="0" y="0"/>
+                      <a:ext cx="5939790" cy="1916430"/>
+                    </a:xfrm>
+                    <a:prstGeom prst="rect">
+                      <a:avLst/>
+                    </a:prstGeom>
+                  </pic:spPr>
+                </pic:pic>
+              </a:graphicData>
+            </a:graphic>
+          </wp:inline>
+        </w:drawing>
       </w:r>
     </w:p>
     <w:p>
@@ -2191,6 +2482,10 @@
     <w:p>
       <w:pPr>
         <w:pStyle w:val="SourceCode"/>
+        <w:jc w:val="center"/>
+        <w:rPr>
+          <w:rStyle w:val="NormalTok"/>
+        </w:rPr>
       </w:pPr>
       <w:proofErr w:type="spellStart"/>
       <w:r>
@@ -2319,6 +2614,7 @@
         <w:t xml:space="preserve">"SELECT </w:t>
       </w:r>
       <w:proofErr w:type="spellStart"/>
+      <w:proofErr w:type="gramStart"/>
       <w:r>
         <w:rPr>
           <w:rStyle w:val="StringTok"/>
@@ -2326,6 +2622,7 @@
         <w:t>u.usuario</w:t>
       </w:r>
       <w:proofErr w:type="spellEnd"/>
+      <w:proofErr w:type="gramEnd"/>
       <w:r>
         <w:rPr>
           <w:rStyle w:val="StringTok"/>
@@ -2440,6 +2737,7 @@
         <w:rPr>
           <w:rStyle w:val="KeywordTok"/>
         </w:rPr>
+        <w:lastRenderedPageBreak/>
         <w:t>|</w:t>
       </w:r>
       <w:r>
@@ -2466,6 +2764,55 @@
         <w:br/>
       </w:r>
       <w:r>
+        <w:rPr>
+          <w:noProof/>
+        </w:rPr>
+        <w:drawing>
+          <wp:inline distT="0" distB="0" distL="0" distR="0" wp14:anchorId="670F30CC" wp14:editId="76420F37">
+            <wp:extent cx="5939790" cy="4352925"/>
+            <wp:effectExtent l="0" t="0" r="0" b="0"/>
+            <wp:docPr id="7" name="Imagen 7"/>
+            <wp:cNvGraphicFramePr>
+              <a:graphicFrameLocks xmlns:a="http://schemas.openxmlformats.org/drawingml/2006/main" noChangeAspect="1"/>
+            </wp:cNvGraphicFramePr>
+            <a:graphic xmlns:a="http://schemas.openxmlformats.org/drawingml/2006/main">
+              <a:graphicData uri="http://schemas.openxmlformats.org/drawingml/2006/picture">
+                <pic:pic xmlns:pic="http://schemas.openxmlformats.org/drawingml/2006/picture">
+                  <pic:nvPicPr>
+                    <pic:cNvPr id="1" name=""/>
+                    <pic:cNvPicPr/>
+                  </pic:nvPicPr>
+                  <pic:blipFill>
+                    <a:blip r:embed="rId16"/>
+                    <a:stretch>
+                      <a:fillRect/>
+                    </a:stretch>
+                  </pic:blipFill>
+                  <pic:spPr>
+                    <a:xfrm>
+                      <a:off x="0" y="0"/>
+                      <a:ext cx="5939790" cy="4352925"/>
+                    </a:xfrm>
+                    <a:prstGeom prst="rect">
+                      <a:avLst/>
+                    </a:prstGeom>
+                  </pic:spPr>
+                </pic:pic>
+              </a:graphicData>
+            </a:graphic>
+          </wp:inline>
+        </w:drawing>
+      </w:r>
+    </w:p>
+    <w:p>
+      <w:pPr>
+        <w:pStyle w:val="SourceCode"/>
+        <w:jc w:val="center"/>
+        <w:rPr>
+          <w:rStyle w:val="NormalTok"/>
+        </w:rPr>
+      </w:pPr>
+      <w:r>
         <w:br/>
       </w:r>
       <w:proofErr w:type="spellStart"/>
@@ -2625,6 +2972,52 @@
           <w:rStyle w:val="NormalTok"/>
         </w:rPr>
         <w:t xml:space="preserve"> evidencias/P4_genericas.txt</w:t>
+      </w:r>
+    </w:p>
+    <w:p>
+      <w:pPr>
+        <w:pStyle w:val="SourceCode"/>
+      </w:pPr>
+      <w:r>
+        <w:rPr>
+          <w:noProof/>
+        </w:rPr>
+        <w:lastRenderedPageBreak/>
+        <w:drawing>
+          <wp:inline distT="0" distB="0" distL="0" distR="0" wp14:anchorId="53835F27" wp14:editId="5F1BA05A">
+            <wp:extent cx="5939790" cy="4351655"/>
+            <wp:effectExtent l="0" t="0" r="0" b="0"/>
+            <wp:docPr id="8" name="Imagen 8"/>
+            <wp:cNvGraphicFramePr>
+              <a:graphicFrameLocks xmlns:a="http://schemas.openxmlformats.org/drawingml/2006/main" noChangeAspect="1"/>
+            </wp:cNvGraphicFramePr>
+            <a:graphic xmlns:a="http://schemas.openxmlformats.org/drawingml/2006/main">
+              <a:graphicData uri="http://schemas.openxmlformats.org/drawingml/2006/picture">
+                <pic:pic xmlns:pic="http://schemas.openxmlformats.org/drawingml/2006/picture">
+                  <pic:nvPicPr>
+                    <pic:cNvPr id="1" name=""/>
+                    <pic:cNvPicPr/>
+                  </pic:nvPicPr>
+                  <pic:blipFill>
+                    <a:blip r:embed="rId17"/>
+                    <a:stretch>
+                      <a:fillRect/>
+                    </a:stretch>
+                  </pic:blipFill>
+                  <pic:spPr>
+                    <a:xfrm>
+                      <a:off x="0" y="0"/>
+                      <a:ext cx="5939790" cy="4351655"/>
+                    </a:xfrm>
+                    <a:prstGeom prst="rect">
+                      <a:avLst/>
+                    </a:prstGeom>
+                  </pic:spPr>
+                </pic:pic>
+              </a:graphicData>
+            </a:graphic>
+          </wp:inline>
+        </w:drawing>
       </w:r>
     </w:p>
     <w:p>
@@ -2636,7 +3029,6 @@
           <w:b/>
           <w:bCs/>
         </w:rPr>
-        <w:lastRenderedPageBreak/>
         <w:t>Anota</w:t>
       </w:r>
       <w:r>
@@ -2724,6 +3116,9 @@
     <w:p>
       <w:pPr>
         <w:pStyle w:val="SourceCode"/>
+        <w:rPr>
+          <w:rStyle w:val="NormalTok"/>
+        </w:rPr>
       </w:pPr>
       <w:proofErr w:type="spellStart"/>
       <w:r>
@@ -2943,6 +3338,46 @@
         <w:br/>
       </w:r>
       <w:r>
+        <w:rPr>
+          <w:noProof/>
+        </w:rPr>
+        <w:drawing>
+          <wp:inline distT="0" distB="0" distL="0" distR="0" wp14:anchorId="49C55700" wp14:editId="081AD106">
+            <wp:extent cx="5939790" cy="2032635"/>
+            <wp:effectExtent l="0" t="0" r="0" b="0"/>
+            <wp:docPr id="9" name="Imagen 9"/>
+            <wp:cNvGraphicFramePr>
+              <a:graphicFrameLocks xmlns:a="http://schemas.openxmlformats.org/drawingml/2006/main" noChangeAspect="1"/>
+            </wp:cNvGraphicFramePr>
+            <a:graphic xmlns:a="http://schemas.openxmlformats.org/drawingml/2006/main">
+              <a:graphicData uri="http://schemas.openxmlformats.org/drawingml/2006/picture">
+                <pic:pic xmlns:pic="http://schemas.openxmlformats.org/drawingml/2006/picture">
+                  <pic:nvPicPr>
+                    <pic:cNvPr id="1" name=""/>
+                    <pic:cNvPicPr/>
+                  </pic:nvPicPr>
+                  <pic:blipFill>
+                    <a:blip r:embed="rId18"/>
+                    <a:stretch>
+                      <a:fillRect/>
+                    </a:stretch>
+                  </pic:blipFill>
+                  <pic:spPr>
+                    <a:xfrm>
+                      <a:off x="0" y="0"/>
+                      <a:ext cx="5939790" cy="2032635"/>
+                    </a:xfrm>
+                    <a:prstGeom prst="rect">
+                      <a:avLst/>
+                    </a:prstGeom>
+                  </pic:spPr>
+                </pic:pic>
+              </a:graphicData>
+            </a:graphic>
+          </wp:inline>
+        </w:drawing>
+      </w:r>
+      <w:r>
         <w:br/>
       </w:r>
       <w:proofErr w:type="spellStart"/>
@@ -3076,6 +3511,7 @@
         <w:rPr>
           <w:rStyle w:val="StringTok"/>
         </w:rPr>
+        <w:lastRenderedPageBreak/>
         <w:t>usuario_registra</w:t>
       </w:r>
       <w:proofErr w:type="spellEnd"/>
@@ -3128,6 +3564,51 @@
           <w:rStyle w:val="NormalTok"/>
         </w:rPr>
         <w:t xml:space="preserve"> evidencias/P5_segregacion.txt</w:t>
+      </w:r>
+    </w:p>
+    <w:p>
+      <w:pPr>
+        <w:pStyle w:val="SourceCode"/>
+      </w:pPr>
+      <w:r>
+        <w:rPr>
+          <w:noProof/>
+        </w:rPr>
+        <w:drawing>
+          <wp:inline distT="0" distB="0" distL="0" distR="0" wp14:anchorId="297A837C" wp14:editId="00AC34C9">
+            <wp:extent cx="5939790" cy="4364355"/>
+            <wp:effectExtent l="0" t="0" r="0" b="0"/>
+            <wp:docPr id="10" name="Imagen 10"/>
+            <wp:cNvGraphicFramePr>
+              <a:graphicFrameLocks xmlns:a="http://schemas.openxmlformats.org/drawingml/2006/main" noChangeAspect="1"/>
+            </wp:cNvGraphicFramePr>
+            <a:graphic xmlns:a="http://schemas.openxmlformats.org/drawingml/2006/main">
+              <a:graphicData uri="http://schemas.openxmlformats.org/drawingml/2006/picture">
+                <pic:pic xmlns:pic="http://schemas.openxmlformats.org/drawingml/2006/picture">
+                  <pic:nvPicPr>
+                    <pic:cNvPr id="1" name=""/>
+                    <pic:cNvPicPr/>
+                  </pic:nvPicPr>
+                  <pic:blipFill>
+                    <a:blip r:embed="rId19"/>
+                    <a:stretch>
+                      <a:fillRect/>
+                    </a:stretch>
+                  </pic:blipFill>
+                  <pic:spPr>
+                    <a:xfrm>
+                      <a:off x="0" y="0"/>
+                      <a:ext cx="5939790" cy="4364355"/>
+                    </a:xfrm>
+                    <a:prstGeom prst="rect">
+                      <a:avLst/>
+                    </a:prstGeom>
+                  </pic:spPr>
+                </pic:pic>
+              </a:graphicData>
+            </a:graphic>
+          </wp:inline>
+        </w:drawing>
       </w:r>
     </w:p>
     <w:p>
@@ -3159,6 +3640,7 @@
       <w:pPr>
         <w:pStyle w:val="SourceCode"/>
         <w:rPr>
+          <w:rStyle w:val="NormalTok"/>
           <w:lang w:val="en-US"/>
         </w:rPr>
       </w:pPr>
@@ -3387,6 +3869,55 @@
     </w:p>
     <w:p>
       <w:pPr>
+        <w:pStyle w:val="SourceCode"/>
+        <w:rPr>
+          <w:lang w:val="en-US"/>
+        </w:rPr>
+      </w:pPr>
+      <w:r>
+        <w:rPr>
+          <w:noProof/>
+          <w:lang w:val="en-US"/>
+        </w:rPr>
+        <w:drawing>
+          <wp:inline distT="0" distB="0" distL="0" distR="0" wp14:anchorId="0D7B3B11" wp14:editId="00753FE8">
+            <wp:extent cx="5939790" cy="2537460"/>
+            <wp:effectExtent l="0" t="0" r="0" b="0"/>
+            <wp:docPr id="11" name="Imagen 11"/>
+            <wp:cNvGraphicFramePr>
+              <a:graphicFrameLocks xmlns:a="http://schemas.openxmlformats.org/drawingml/2006/main" noChangeAspect="1"/>
+            </wp:cNvGraphicFramePr>
+            <a:graphic xmlns:a="http://schemas.openxmlformats.org/drawingml/2006/main">
+              <a:graphicData uri="http://schemas.openxmlformats.org/drawingml/2006/picture">
+                <pic:pic xmlns:pic="http://schemas.openxmlformats.org/drawingml/2006/picture">
+                  <pic:nvPicPr>
+                    <pic:cNvPr id="1" name=""/>
+                    <pic:cNvPicPr/>
+                  </pic:nvPicPr>
+                  <pic:blipFill>
+                    <a:blip r:embed="rId20"/>
+                    <a:stretch>
+                      <a:fillRect/>
+                    </a:stretch>
+                  </pic:blipFill>
+                  <pic:spPr>
+                    <a:xfrm>
+                      <a:off x="0" y="0"/>
+                      <a:ext cx="5939790" cy="2537460"/>
+                    </a:xfrm>
+                    <a:prstGeom prst="rect">
+                      <a:avLst/>
+                    </a:prstGeom>
+                  </pic:spPr>
+                </pic:pic>
+              </a:graphicData>
+            </a:graphic>
+          </wp:inline>
+        </w:drawing>
+      </w:r>
+    </w:p>
+    <w:p>
+      <w:pPr>
         <w:pStyle w:val="FirstParagraph"/>
       </w:pPr>
       <w:r>
@@ -3394,6 +3925,7 @@
           <w:b/>
           <w:bCs/>
         </w:rPr>
+        <w:lastRenderedPageBreak/>
         <w:t>Anota</w:t>
       </w:r>
       <w:r>
@@ -3602,6 +4134,62 @@
       <w:r>
         <w:br/>
       </w:r>
+    </w:p>
+    <w:p>
+      <w:pPr>
+        <w:pStyle w:val="SourceCode"/>
+        <w:rPr>
+          <w:rStyle w:val="ExtensionTok"/>
+        </w:rPr>
+      </w:pPr>
+      <w:r>
+        <w:rPr>
+          <w:noProof/>
+        </w:rPr>
+        <w:drawing>
+          <wp:inline distT="0" distB="0" distL="0" distR="0" wp14:anchorId="12ABCC0C" wp14:editId="2CF8208A">
+            <wp:extent cx="5939790" cy="2472690"/>
+            <wp:effectExtent l="0" t="0" r="0" b="0"/>
+            <wp:docPr id="12" name="Imagen 12"/>
+            <wp:cNvGraphicFramePr>
+              <a:graphicFrameLocks xmlns:a="http://schemas.openxmlformats.org/drawingml/2006/main" noChangeAspect="1"/>
+            </wp:cNvGraphicFramePr>
+            <a:graphic xmlns:a="http://schemas.openxmlformats.org/drawingml/2006/main">
+              <a:graphicData uri="http://schemas.openxmlformats.org/drawingml/2006/picture">
+                <pic:pic xmlns:pic="http://schemas.openxmlformats.org/drawingml/2006/picture">
+                  <pic:nvPicPr>
+                    <pic:cNvPr id="1" name=""/>
+                    <pic:cNvPicPr/>
+                  </pic:nvPicPr>
+                  <pic:blipFill>
+                    <a:blip r:embed="rId21"/>
+                    <a:stretch>
+                      <a:fillRect/>
+                    </a:stretch>
+                  </pic:blipFill>
+                  <pic:spPr>
+                    <a:xfrm>
+                      <a:off x="0" y="0"/>
+                      <a:ext cx="5939790" cy="2472690"/>
+                    </a:xfrm>
+                    <a:prstGeom prst="rect">
+                      <a:avLst/>
+                    </a:prstGeom>
+                  </pic:spPr>
+                </pic:pic>
+              </a:graphicData>
+            </a:graphic>
+          </wp:inline>
+        </w:drawing>
+      </w:r>
+    </w:p>
+    <w:p>
+      <w:pPr>
+        <w:pStyle w:val="SourceCode"/>
+        <w:rPr>
+          <w:rStyle w:val="StringTok"/>
+        </w:rPr>
+      </w:pPr>
       <w:r>
         <w:br/>
       </w:r>
@@ -3719,6 +4307,62 @@
         </w:rPr>
         <w:t>"</w:t>
       </w:r>
+    </w:p>
+    <w:p>
+      <w:pPr>
+        <w:pStyle w:val="SourceCode"/>
+        <w:rPr>
+          <w:rStyle w:val="ExtensionTok"/>
+        </w:rPr>
+      </w:pPr>
+      <w:r>
+        <w:rPr>
+          <w:noProof/>
+        </w:rPr>
+        <w:drawing>
+          <wp:inline distT="0" distB="0" distL="0" distR="0" wp14:anchorId="76AB0168" wp14:editId="06D0E3F2">
+            <wp:extent cx="5939790" cy="1896745"/>
+            <wp:effectExtent l="0" t="0" r="0" b="0"/>
+            <wp:docPr id="13" name="Imagen 13"/>
+            <wp:cNvGraphicFramePr>
+              <a:graphicFrameLocks xmlns:a="http://schemas.openxmlformats.org/drawingml/2006/main" noChangeAspect="1"/>
+            </wp:cNvGraphicFramePr>
+            <a:graphic xmlns:a="http://schemas.openxmlformats.org/drawingml/2006/main">
+              <a:graphicData uri="http://schemas.openxmlformats.org/drawingml/2006/picture">
+                <pic:pic xmlns:pic="http://schemas.openxmlformats.org/drawingml/2006/picture">
+                  <pic:nvPicPr>
+                    <pic:cNvPr id="1" name=""/>
+                    <pic:cNvPicPr/>
+                  </pic:nvPicPr>
+                  <pic:blipFill>
+                    <a:blip r:embed="rId22"/>
+                    <a:stretch>
+                      <a:fillRect/>
+                    </a:stretch>
+                  </pic:blipFill>
+                  <pic:spPr>
+                    <a:xfrm>
+                      <a:off x="0" y="0"/>
+                      <a:ext cx="5939790" cy="1896745"/>
+                    </a:xfrm>
+                    <a:prstGeom prst="rect">
+                      <a:avLst/>
+                    </a:prstGeom>
+                  </pic:spPr>
+                </pic:pic>
+              </a:graphicData>
+            </a:graphic>
+          </wp:inline>
+        </w:drawing>
+      </w:r>
+    </w:p>
+    <w:p>
+      <w:pPr>
+        <w:pStyle w:val="SourceCode"/>
+        <w:rPr>
+          <w:rStyle w:val="NormalTok"/>
+        </w:rPr>
+      </w:pPr>
       <w:r>
         <w:br/>
       </w:r>
@@ -3854,6 +4498,55 @@
         </w:rPr>
         <w:t xml:space="preserve"> respaldos/core_2025-11-14.sql</w:t>
       </w:r>
+    </w:p>
+    <w:p>
+      <w:pPr>
+        <w:pStyle w:val="SourceCode"/>
+        <w:rPr>
+          <w:rStyle w:val="NormalTok"/>
+        </w:rPr>
+      </w:pPr>
+      <w:r>
+        <w:rPr>
+          <w:noProof/>
+        </w:rPr>
+        <w:lastRenderedPageBreak/>
+        <w:drawing>
+          <wp:inline distT="0" distB="0" distL="0" distR="0" wp14:anchorId="35877F31" wp14:editId="64F46C12">
+            <wp:extent cx="5939790" cy="1781175"/>
+            <wp:effectExtent l="0" t="0" r="0" b="0"/>
+            <wp:docPr id="14" name="Imagen 14"/>
+            <wp:cNvGraphicFramePr>
+              <a:graphicFrameLocks xmlns:a="http://schemas.openxmlformats.org/drawingml/2006/main" noChangeAspect="1"/>
+            </wp:cNvGraphicFramePr>
+            <a:graphic xmlns:a="http://schemas.openxmlformats.org/drawingml/2006/main">
+              <a:graphicData uri="http://schemas.openxmlformats.org/drawingml/2006/picture">
+                <pic:pic xmlns:pic="http://schemas.openxmlformats.org/drawingml/2006/picture">
+                  <pic:nvPicPr>
+                    <pic:cNvPr id="1" name=""/>
+                    <pic:cNvPicPr/>
+                  </pic:nvPicPr>
+                  <pic:blipFill>
+                    <a:blip r:embed="rId23"/>
+                    <a:stretch>
+                      <a:fillRect/>
+                    </a:stretch>
+                  </pic:blipFill>
+                  <pic:spPr>
+                    <a:xfrm>
+                      <a:off x="0" y="0"/>
+                      <a:ext cx="5939790" cy="1781175"/>
+                    </a:xfrm>
+                    <a:prstGeom prst="rect">
+                      <a:avLst/>
+                    </a:prstGeom>
+                  </pic:spPr>
+                </pic:pic>
+              </a:graphicData>
+            </a:graphic>
+          </wp:inline>
+        </w:drawing>
+      </w:r>
       <w:r>
         <w:br/>
       </w:r>
@@ -4028,6 +4721,51 @@
           <w:rStyle w:val="NormalTok"/>
         </w:rPr>
         <w:t xml:space="preserve"> evidencias/P7_restauracion.txt</w:t>
+      </w:r>
+    </w:p>
+    <w:p>
+      <w:pPr>
+        <w:pStyle w:val="SourceCode"/>
+      </w:pPr>
+      <w:r>
+        <w:rPr>
+          <w:noProof/>
+        </w:rPr>
+        <w:drawing>
+          <wp:inline distT="0" distB="0" distL="0" distR="0" wp14:anchorId="4D364901" wp14:editId="5C50B899">
+            <wp:extent cx="5939790" cy="1688465"/>
+            <wp:effectExtent l="0" t="0" r="0" b="0"/>
+            <wp:docPr id="15" name="Imagen 15"/>
+            <wp:cNvGraphicFramePr>
+              <a:graphicFrameLocks xmlns:a="http://schemas.openxmlformats.org/drawingml/2006/main" noChangeAspect="1"/>
+            </wp:cNvGraphicFramePr>
+            <a:graphic xmlns:a="http://schemas.openxmlformats.org/drawingml/2006/main">
+              <a:graphicData uri="http://schemas.openxmlformats.org/drawingml/2006/picture">
+                <pic:pic xmlns:pic="http://schemas.openxmlformats.org/drawingml/2006/picture">
+                  <pic:nvPicPr>
+                    <pic:cNvPr id="1" name=""/>
+                    <pic:cNvPicPr/>
+                  </pic:nvPicPr>
+                  <pic:blipFill>
+                    <a:blip r:embed="rId24"/>
+                    <a:stretch>
+                      <a:fillRect/>
+                    </a:stretch>
+                  </pic:blipFill>
+                  <pic:spPr>
+                    <a:xfrm>
+                      <a:off x="0" y="0"/>
+                      <a:ext cx="5939790" cy="1688465"/>
+                    </a:xfrm>
+                    <a:prstGeom prst="rect">
+                      <a:avLst/>
+                    </a:prstGeom>
+                  </pic:spPr>
+                </pic:pic>
+              </a:graphicData>
+            </a:graphic>
+          </wp:inline>
+        </w:drawing>
       </w:r>
     </w:p>
     <w:p>
@@ -4123,6 +4861,1357 @@
       </w:r>
       <w:r>
         <w:t>.</w:t>
+      </w:r>
+    </w:p>
+    <w:tbl>
+      <w:tblPr>
+        <w:tblStyle w:val="Table"/>
+        <w:tblW w:w="5000" w:type="pct"/>
+        <w:tblLayout w:type="fixed"/>
+        <w:tblLook w:val="0020" w:firstRow="1" w:lastRow="0" w:firstColumn="0" w:lastColumn="0" w:noHBand="0" w:noVBand="0"/>
+      </w:tblPr>
+      <w:tblGrid>
+        <w:gridCol w:w="4785"/>
+        <w:gridCol w:w="4785"/>
+      </w:tblGrid>
+      <w:tr>
+        <w:trPr>
+          <w:cnfStyle w:val="100000000000" w:firstRow="1" w:lastRow="0" w:firstColumn="0" w:lastColumn="0" w:oddVBand="0" w:evenVBand="0" w:oddHBand="0" w:evenHBand="0" w:firstRowFirstColumn="0" w:firstRowLastColumn="0" w:lastRowFirstColumn="0" w:lastRowLastColumn="0"/>
+          <w:tblHeader/>
+        </w:trPr>
+        <w:tc>
+          <w:tcPr>
+            <w:tcW w:w="4785" w:type="dxa"/>
+          </w:tcPr>
+          <w:p>
+            <w:pPr>
+              <w:pStyle w:val="Compact"/>
+            </w:pPr>
+            <w:r>
+              <w:t>Elemento</w:t>
+            </w:r>
+          </w:p>
+        </w:tc>
+        <w:tc>
+          <w:tcPr>
+            <w:tcW w:w="4785" w:type="dxa"/>
+          </w:tcPr>
+          <w:p>
+            <w:pPr>
+              <w:pStyle w:val="Compact"/>
+            </w:pPr>
+            <w:r>
+              <w:t>Qué escribes</w:t>
+            </w:r>
+          </w:p>
+        </w:tc>
+      </w:tr>
+      <w:tr>
+        <w:tc>
+          <w:tcPr>
+            <w:tcW w:w="4785" w:type="dxa"/>
+          </w:tcPr>
+          <w:p>
+            <w:pPr>
+              <w:pStyle w:val="Compact"/>
+            </w:pPr>
+            <w:r>
+              <w:t>Título</w:t>
+            </w:r>
+          </w:p>
+        </w:tc>
+        <w:tc>
+          <w:tcPr>
+            <w:tcW w:w="4785" w:type="dxa"/>
+          </w:tcPr>
+          <w:p>
+            <w:pPr>
+              <w:pStyle w:val="Compact"/>
+            </w:pPr>
+            <w:r>
+              <w:t>El problema en una línea</w:t>
+            </w:r>
+          </w:p>
+        </w:tc>
+      </w:tr>
+      <w:tr>
+        <w:tc>
+          <w:tcPr>
+            <w:tcW w:w="4785" w:type="dxa"/>
+          </w:tcPr>
+          <w:p>
+            <w:pPr>
+              <w:pStyle w:val="Compact"/>
+            </w:pPr>
+            <w:r>
+              <w:t>Condición</w:t>
+            </w:r>
+          </w:p>
+        </w:tc>
+        <w:tc>
+          <w:tcPr>
+            <w:tcW w:w="4785" w:type="dxa"/>
+          </w:tcPr>
+          <w:p>
+            <w:pPr>
+              <w:pStyle w:val="Compact"/>
+            </w:pPr>
+            <w:r>
+              <w:t>Lo que encontraste, con cifras y el archivo de evidencia</w:t>
+            </w:r>
+          </w:p>
+        </w:tc>
+      </w:tr>
+      <w:tr>
+        <w:tc>
+          <w:tcPr>
+            <w:tcW w:w="4785" w:type="dxa"/>
+          </w:tcPr>
+          <w:p>
+            <w:pPr>
+              <w:pStyle w:val="Compact"/>
+            </w:pPr>
+            <w:r>
+              <w:t>Criterio</w:t>
+            </w:r>
+          </w:p>
+        </w:tc>
+        <w:tc>
+          <w:tcPr>
+            <w:tcW w:w="4785" w:type="dxa"/>
+          </w:tcPr>
+          <w:p>
+            <w:pPr>
+              <w:pStyle w:val="Compact"/>
+            </w:pPr>
+            <w:r>
+              <w:t>La regla de la política y su control de referencia, con el código</w:t>
+            </w:r>
+          </w:p>
+        </w:tc>
+      </w:tr>
+      <w:tr>
+        <w:tc>
+          <w:tcPr>
+            <w:tcW w:w="4785" w:type="dxa"/>
+          </w:tcPr>
+          <w:p>
+            <w:pPr>
+              <w:pStyle w:val="Compact"/>
+            </w:pPr>
+            <w:r>
+              <w:t>Causa</w:t>
+            </w:r>
+          </w:p>
+        </w:tc>
+        <w:tc>
+          <w:tcPr>
+            <w:tcW w:w="4785" w:type="dxa"/>
+          </w:tcPr>
+          <w:p>
+            <w:pPr>
+              <w:pStyle w:val="Compact"/>
+            </w:pPr>
+            <w:r>
+              <w:t>Por qué ocurre, según lo que viste en los archivos del paquete. «Falta de control» no es una causa</w:t>
+            </w:r>
+          </w:p>
+        </w:tc>
+      </w:tr>
+      <w:tr>
+        <w:tc>
+          <w:tcPr>
+            <w:tcW w:w="4785" w:type="dxa"/>
+          </w:tcPr>
+          <w:p>
+            <w:pPr>
+              <w:pStyle w:val="Compact"/>
+            </w:pPr>
+            <w:r>
+              <w:t>Efecto</w:t>
+            </w:r>
+          </w:p>
+        </w:tc>
+        <w:tc>
+          <w:tcPr>
+            <w:tcW w:w="4785" w:type="dxa"/>
+          </w:tcPr>
+          <w:p>
+            <w:pPr>
+              <w:pStyle w:val="Compact"/>
+            </w:pPr>
+            <w:r>
+              <w:t>Qué le puede pasar a la cooperativa, en soles, cuentas o días</w:t>
+            </w:r>
+          </w:p>
+        </w:tc>
+      </w:tr>
+      <w:tr>
+        <w:tc>
+          <w:tcPr>
+            <w:tcW w:w="4785" w:type="dxa"/>
+          </w:tcPr>
+          <w:p>
+            <w:pPr>
+              <w:pStyle w:val="Compact"/>
+            </w:pPr>
+            <w:r>
+              <w:t>Recomendación</w:t>
+            </w:r>
+          </w:p>
+        </w:tc>
+        <w:tc>
+          <w:tcPr>
+            <w:tcW w:w="4785" w:type="dxa"/>
+          </w:tcPr>
+          <w:p>
+            <w:pPr>
+              <w:pStyle w:val="Compact"/>
+            </w:pPr>
+            <w:r>
+              <w:t>Qué hacer, quién lo hace y en qué plazo</w:t>
+            </w:r>
+          </w:p>
+        </w:tc>
+      </w:tr>
+    </w:tbl>
+    <w:p>
+      <w:pPr>
+        <w:pStyle w:val="Ttulo2"/>
+      </w:pPr>
+      <w:bookmarkStart w:id="14" w:name="paso-4-sube-tu-evidencia-a-github"/>
+      <w:bookmarkEnd w:id="13"/>
+      <w:r>
+        <w:rPr>
+          <w:noProof/>
+        </w:rPr>
+        <w:lastRenderedPageBreak/>
+        <w:drawing>
+          <wp:inline distT="0" distB="0" distL="0" distR="0" wp14:anchorId="3F95C97D" wp14:editId="2F0EC406">
+            <wp:extent cx="5939790" cy="2482850"/>
+            <wp:effectExtent l="0" t="0" r="0" b="0"/>
+            <wp:docPr id="16" name="Imagen 16"/>
+            <wp:cNvGraphicFramePr>
+              <a:graphicFrameLocks xmlns:a="http://schemas.openxmlformats.org/drawingml/2006/main" noChangeAspect="1"/>
+            </wp:cNvGraphicFramePr>
+            <a:graphic xmlns:a="http://schemas.openxmlformats.org/drawingml/2006/main">
+              <a:graphicData uri="http://schemas.openxmlformats.org/drawingml/2006/picture">
+                <pic:pic xmlns:pic="http://schemas.openxmlformats.org/drawingml/2006/picture">
+                  <pic:nvPicPr>
+                    <pic:cNvPr id="1" name=""/>
+                    <pic:cNvPicPr/>
+                  </pic:nvPicPr>
+                  <pic:blipFill>
+                    <a:blip r:embed="rId25"/>
+                    <a:stretch>
+                      <a:fillRect/>
+                    </a:stretch>
+                  </pic:blipFill>
+                  <pic:spPr>
+                    <a:xfrm>
+                      <a:off x="0" y="0"/>
+                      <a:ext cx="5939790" cy="2482850"/>
+                    </a:xfrm>
+                    <a:prstGeom prst="rect">
+                      <a:avLst/>
+                    </a:prstGeom>
+                  </pic:spPr>
+                </pic:pic>
+              </a:graphicData>
+            </a:graphic>
+          </wp:inline>
+        </w:drawing>
+      </w:r>
+    </w:p>
+    <w:p>
+      <w:pPr>
+        <w:pStyle w:val="Ttulo2"/>
+      </w:pPr>
+      <w:r>
+        <w:t>Paso 4 · Sube tu evidencia a GitHub</w:t>
+      </w:r>
+    </w:p>
+    <w:p>
+      <w:pPr>
+        <w:pStyle w:val="Compact"/>
+        <w:numPr>
+          <w:ilvl w:val="0"/>
+          <w:numId w:val="7"/>
+        </w:numPr>
+      </w:pPr>
+      <w:r>
+        <w:t xml:space="preserve">Crea en https://github.com/new un repositorio </w:t>
+      </w:r>
+      <w:r>
+        <w:rPr>
+          <w:b/>
+          <w:bCs/>
+        </w:rPr>
+        <w:t>público y vacío</w:t>
+      </w:r>
+      <w:r>
+        <w:t xml:space="preserve"> llamado </w:t>
+      </w:r>
+      <w:r>
+        <w:rPr>
+          <w:rStyle w:val="VerbatimChar"/>
+        </w:rPr>
+        <w:t>si084-caso-coopac</w:t>
+      </w:r>
+      <w:r>
+        <w:t>.</w:t>
+      </w:r>
+    </w:p>
+    <w:p>
+      <w:pPr>
+        <w:pStyle w:val="Compact"/>
+        <w:numPr>
+          <w:ilvl w:val="0"/>
+          <w:numId w:val="7"/>
+        </w:numPr>
+      </w:pPr>
+      <w:r>
+        <w:t xml:space="preserve">Escribe en la carátula de </w:t>
+      </w:r>
+      <w:r>
+        <w:rPr>
+          <w:rStyle w:val="VerbatimChar"/>
+        </w:rPr>
+        <w:t>INFORME.md</w:t>
+      </w:r>
+      <w:r>
+        <w:t xml:space="preserve"> tu nombre, tu código y la URL </w:t>
+      </w:r>
+      <w:r>
+        <w:rPr>
+          <w:rStyle w:val="VerbatimChar"/>
+        </w:rPr>
+        <w:t>https://github.com/&lt;usuario&gt;/si084-caso-coopac/tree/examen-u1</w:t>
+      </w:r>
+      <w:r>
+        <w:t>.</w:t>
+      </w:r>
+    </w:p>
+    <w:p>
+      <w:pPr>
+        <w:pStyle w:val="Compact"/>
+        <w:numPr>
+          <w:ilvl w:val="0"/>
+          <w:numId w:val="7"/>
+        </w:numPr>
+      </w:pPr>
+      <w:r>
+        <w:t xml:space="preserve">Sella la evidencia, sube el repositorio y crea la etiqueta </w:t>
+      </w:r>
+      <w:r>
+        <w:rPr>
+          <w:rStyle w:val="VerbatimChar"/>
+        </w:rPr>
+        <w:t>examen-u1</w:t>
+      </w:r>
+      <w:r>
+        <w:t xml:space="preserve">. Cambia </w:t>
+      </w:r>
+      <w:r>
+        <w:rPr>
+          <w:rStyle w:val="VerbatimChar"/>
+        </w:rPr>
+        <w:t>&lt;usuario&gt;</w:t>
+      </w:r>
+      <w:r>
+        <w:t xml:space="preserve"> por tu usuario de GitHub.</w:t>
+      </w:r>
+    </w:p>
+    <w:p>
+      <w:pPr>
+        <w:pStyle w:val="SourceCode"/>
+        <w:rPr>
+          <w:rStyle w:val="NormalTok"/>
+        </w:rPr>
+      </w:pPr>
+      <w:r>
+        <w:rPr>
+          <w:rStyle w:val="FunctionTok"/>
+        </w:rPr>
+        <w:t>sha256sum</w:t>
+      </w:r>
+      <w:r>
+        <w:rPr>
+          <w:rStyle w:val="NormalTok"/>
+        </w:rPr>
+        <w:t xml:space="preserve"> evidencias/</w:t>
+      </w:r>
+      <w:r>
+        <w:rPr>
+          <w:rStyle w:val="PreprocessorTok"/>
+        </w:rPr>
+        <w:t>*</w:t>
+      </w:r>
+      <w:r>
+        <w:rPr>
+          <w:rStyle w:val="NormalTok"/>
+        </w:rPr>
+        <w:t>.</w:t>
+      </w:r>
+      <w:proofErr w:type="spellStart"/>
+      <w:r>
+        <w:rPr>
+          <w:rStyle w:val="NormalTok"/>
+        </w:rPr>
+        <w:t>txt</w:t>
+      </w:r>
+      <w:proofErr w:type="spellEnd"/>
+      <w:r>
+        <w:rPr>
+          <w:rStyle w:val="NormalTok"/>
+        </w:rPr>
+        <w:t xml:space="preserve"> </w:t>
+      </w:r>
+      <w:r>
+        <w:rPr>
+          <w:rStyle w:val="OperatorTok"/>
+        </w:rPr>
+        <w:t>&gt;</w:t>
+      </w:r>
+      <w:r>
+        <w:rPr>
+          <w:rStyle w:val="NormalTok"/>
+        </w:rPr>
+        <w:t xml:space="preserve"> evidencias/SHA256SUMS.txt</w:t>
+      </w:r>
+      <w:r>
+        <w:br/>
+      </w:r>
+      <w:proofErr w:type="spellStart"/>
+      <w:r>
+        <w:rPr>
+          <w:rStyle w:val="FunctionTok"/>
+        </w:rPr>
+        <w:t>git</w:t>
+      </w:r>
+      <w:proofErr w:type="spellEnd"/>
+      <w:r>
+        <w:rPr>
+          <w:rStyle w:val="NormalTok"/>
+        </w:rPr>
+        <w:t xml:space="preserve"> </w:t>
+      </w:r>
+      <w:proofErr w:type="spellStart"/>
+      <w:r>
+        <w:rPr>
+          <w:rStyle w:val="NormalTok"/>
+        </w:rPr>
+        <w:t>init</w:t>
+      </w:r>
+      <w:proofErr w:type="spellEnd"/>
+      <w:r>
+        <w:rPr>
+          <w:rStyle w:val="NormalTok"/>
+        </w:rPr>
+        <w:t xml:space="preserve"> </w:t>
+      </w:r>
+      <w:r>
+        <w:rPr>
+          <w:rStyle w:val="AttributeTok"/>
+        </w:rPr>
+        <w:t>-b</w:t>
+      </w:r>
+      <w:r>
+        <w:rPr>
+          <w:rStyle w:val="NormalTok"/>
+        </w:rPr>
+        <w:t xml:space="preserve"> </w:t>
+      </w:r>
+      <w:proofErr w:type="spellStart"/>
+      <w:r>
+        <w:rPr>
+          <w:rStyle w:val="NormalTok"/>
+        </w:rPr>
+        <w:t>main</w:t>
+      </w:r>
+      <w:proofErr w:type="spellEnd"/>
+      <w:r>
+        <w:br/>
+      </w:r>
+      <w:proofErr w:type="spellStart"/>
+      <w:r>
+        <w:rPr>
+          <w:rStyle w:val="FunctionTok"/>
+        </w:rPr>
+        <w:t>git</w:t>
+      </w:r>
+      <w:proofErr w:type="spellEnd"/>
+      <w:r>
+        <w:rPr>
+          <w:rStyle w:val="NormalTok"/>
+        </w:rPr>
+        <w:t xml:space="preserve"> </w:t>
+      </w:r>
+      <w:proofErr w:type="spellStart"/>
+      <w:proofErr w:type="gramStart"/>
+      <w:r>
+        <w:rPr>
+          <w:rStyle w:val="NormalTok"/>
+        </w:rPr>
+        <w:t>add</w:t>
+      </w:r>
+      <w:proofErr w:type="spellEnd"/>
+      <w:r>
+        <w:rPr>
+          <w:rStyle w:val="NormalTok"/>
+        </w:rPr>
+        <w:t xml:space="preserve"> .</w:t>
+      </w:r>
+      <w:proofErr w:type="gramEnd"/>
+      <w:r>
+        <w:br/>
+      </w:r>
+      <w:proofErr w:type="spellStart"/>
+      <w:r>
+        <w:rPr>
+          <w:rStyle w:val="FunctionTok"/>
+        </w:rPr>
+        <w:t>git</w:t>
+      </w:r>
+      <w:proofErr w:type="spellEnd"/>
+      <w:r>
+        <w:rPr>
+          <w:rStyle w:val="NormalTok"/>
+        </w:rPr>
+        <w:t xml:space="preserve"> </w:t>
+      </w:r>
+      <w:proofErr w:type="spellStart"/>
+      <w:r>
+        <w:rPr>
+          <w:rStyle w:val="NormalTok"/>
+        </w:rPr>
+        <w:t>commit</w:t>
+      </w:r>
+      <w:proofErr w:type="spellEnd"/>
+      <w:r>
+        <w:rPr>
+          <w:rStyle w:val="NormalTok"/>
+        </w:rPr>
+        <w:t xml:space="preserve"> </w:t>
+      </w:r>
+      <w:r>
+        <w:rPr>
+          <w:rStyle w:val="AttributeTok"/>
+        </w:rPr>
+        <w:t>-m</w:t>
+      </w:r>
+      <w:r>
+        <w:rPr>
+          <w:rStyle w:val="NormalTok"/>
+        </w:rPr>
+        <w:t xml:space="preserve"> </w:t>
+      </w:r>
+      <w:r>
+        <w:rPr>
+          <w:rStyle w:val="StringTok"/>
+        </w:rPr>
+        <w:t>"Caso COOPAC · examen práctico U1"</w:t>
+      </w:r>
+      <w:r>
+        <w:br/>
+      </w:r>
+      <w:proofErr w:type="spellStart"/>
+      <w:r>
+        <w:rPr>
+          <w:rStyle w:val="FunctionTok"/>
+        </w:rPr>
+        <w:t>git</w:t>
+      </w:r>
+      <w:proofErr w:type="spellEnd"/>
+      <w:r>
+        <w:rPr>
+          <w:rStyle w:val="NormalTok"/>
+        </w:rPr>
+        <w:t xml:space="preserve"> </w:t>
+      </w:r>
+      <w:proofErr w:type="spellStart"/>
+      <w:r>
+        <w:rPr>
+          <w:rStyle w:val="NormalTok"/>
+        </w:rPr>
+        <w:t>remote</w:t>
+      </w:r>
+      <w:proofErr w:type="spellEnd"/>
+      <w:r>
+        <w:rPr>
+          <w:rStyle w:val="NormalTok"/>
+        </w:rPr>
+        <w:t xml:space="preserve"> </w:t>
+      </w:r>
+      <w:proofErr w:type="spellStart"/>
+      <w:r>
+        <w:rPr>
+          <w:rStyle w:val="NormalTok"/>
+        </w:rPr>
+        <w:t>add</w:t>
+      </w:r>
+      <w:proofErr w:type="spellEnd"/>
+      <w:r>
+        <w:rPr>
+          <w:rStyle w:val="NormalTok"/>
+        </w:rPr>
+        <w:t xml:space="preserve"> </w:t>
+      </w:r>
+      <w:proofErr w:type="spellStart"/>
+      <w:r>
+        <w:rPr>
+          <w:rStyle w:val="NormalTok"/>
+        </w:rPr>
+        <w:t>origin</w:t>
+      </w:r>
+      <w:proofErr w:type="spellEnd"/>
+      <w:r>
+        <w:rPr>
+          <w:rStyle w:val="NormalTok"/>
+        </w:rPr>
+        <w:t xml:space="preserve"> https://github.com/</w:t>
+      </w:r>
+      <w:r>
+        <w:rPr>
+          <w:rStyle w:val="OperatorTok"/>
+        </w:rPr>
+        <w:t>&lt;</w:t>
+      </w:r>
+      <w:r>
+        <w:rPr>
+          <w:rStyle w:val="NormalTok"/>
+        </w:rPr>
+        <w:t>usuario</w:t>
+      </w:r>
+      <w:r>
+        <w:rPr>
+          <w:rStyle w:val="OperatorTok"/>
+        </w:rPr>
+        <w:t>&gt;</w:t>
+      </w:r>
+      <w:r>
+        <w:rPr>
+          <w:rStyle w:val="NormalTok"/>
+        </w:rPr>
+        <w:t>/si084-caso-coopac.git</w:t>
+      </w:r>
+      <w:r>
+        <w:br/>
+      </w:r>
+      <w:proofErr w:type="spellStart"/>
+      <w:r>
+        <w:rPr>
+          <w:rStyle w:val="FunctionTok"/>
+        </w:rPr>
+        <w:t>git</w:t>
+      </w:r>
+      <w:proofErr w:type="spellEnd"/>
+      <w:r>
+        <w:rPr>
+          <w:rStyle w:val="NormalTok"/>
+        </w:rPr>
+        <w:t xml:space="preserve"> </w:t>
+      </w:r>
+      <w:proofErr w:type="spellStart"/>
+      <w:r>
+        <w:rPr>
+          <w:rStyle w:val="NormalTok"/>
+        </w:rPr>
+        <w:t>push</w:t>
+      </w:r>
+      <w:proofErr w:type="spellEnd"/>
+      <w:r>
+        <w:rPr>
+          <w:rStyle w:val="NormalTok"/>
+        </w:rPr>
+        <w:t xml:space="preserve"> </w:t>
+      </w:r>
+      <w:r>
+        <w:rPr>
+          <w:rStyle w:val="AttributeTok"/>
+        </w:rPr>
+        <w:t>-u</w:t>
+      </w:r>
+      <w:r>
+        <w:rPr>
+          <w:rStyle w:val="NormalTok"/>
+        </w:rPr>
+        <w:t xml:space="preserve"> </w:t>
+      </w:r>
+      <w:proofErr w:type="spellStart"/>
+      <w:r>
+        <w:rPr>
+          <w:rStyle w:val="NormalTok"/>
+        </w:rPr>
+        <w:t>origin</w:t>
+      </w:r>
+      <w:proofErr w:type="spellEnd"/>
+      <w:r>
+        <w:rPr>
+          <w:rStyle w:val="NormalTok"/>
+        </w:rPr>
+        <w:t xml:space="preserve"> </w:t>
+      </w:r>
+      <w:proofErr w:type="spellStart"/>
+      <w:r>
+        <w:rPr>
+          <w:rStyle w:val="NormalTok"/>
+        </w:rPr>
+        <w:t>main</w:t>
+      </w:r>
+      <w:proofErr w:type="spellEnd"/>
+      <w:r>
+        <w:br/>
+      </w:r>
+      <w:proofErr w:type="spellStart"/>
+      <w:r>
+        <w:rPr>
+          <w:rStyle w:val="FunctionTok"/>
+        </w:rPr>
+        <w:t>git</w:t>
+      </w:r>
+      <w:proofErr w:type="spellEnd"/>
+      <w:r>
+        <w:rPr>
+          <w:rStyle w:val="NormalTok"/>
+        </w:rPr>
+        <w:t xml:space="preserve"> tag examen-u1</w:t>
+      </w:r>
+      <w:r>
+        <w:br/>
+      </w:r>
+      <w:proofErr w:type="spellStart"/>
+      <w:r>
+        <w:rPr>
+          <w:rStyle w:val="FunctionTok"/>
+        </w:rPr>
+        <w:t>git</w:t>
+      </w:r>
+      <w:proofErr w:type="spellEnd"/>
+      <w:r>
+        <w:rPr>
+          <w:rStyle w:val="NormalTok"/>
+        </w:rPr>
+        <w:t xml:space="preserve"> </w:t>
+      </w:r>
+      <w:proofErr w:type="spellStart"/>
+      <w:r>
+        <w:rPr>
+          <w:rStyle w:val="NormalTok"/>
+        </w:rPr>
+        <w:t>push</w:t>
+      </w:r>
+      <w:proofErr w:type="spellEnd"/>
+      <w:r>
+        <w:rPr>
+          <w:rStyle w:val="NormalTok"/>
+        </w:rPr>
+        <w:t xml:space="preserve"> </w:t>
+      </w:r>
+      <w:proofErr w:type="spellStart"/>
+      <w:r>
+        <w:rPr>
+          <w:rStyle w:val="NormalTok"/>
+        </w:rPr>
+        <w:t>origin</w:t>
+      </w:r>
+      <w:proofErr w:type="spellEnd"/>
+      <w:r>
+        <w:rPr>
+          <w:rStyle w:val="NormalTok"/>
+        </w:rPr>
+        <w:t xml:space="preserve"> examen-u1</w:t>
+      </w:r>
+    </w:p>
+    <w:p>
+      <w:pPr>
+        <w:pStyle w:val="SourceCode"/>
+      </w:pPr>
+      <w:r>
+        <w:rPr>
+          <w:noProof/>
+        </w:rPr>
+        <w:lastRenderedPageBreak/>
+        <w:drawing>
+          <wp:inline distT="0" distB="0" distL="0" distR="0" wp14:anchorId="73D1B9C0" wp14:editId="144146A7">
+            <wp:extent cx="5939790" cy="4436110"/>
+            <wp:effectExtent l="0" t="0" r="0" b="0"/>
+            <wp:docPr id="17" name="Imagen 17"/>
+            <wp:cNvGraphicFramePr>
+              <a:graphicFrameLocks xmlns:a="http://schemas.openxmlformats.org/drawingml/2006/main" noChangeAspect="1"/>
+            </wp:cNvGraphicFramePr>
+            <a:graphic xmlns:a="http://schemas.openxmlformats.org/drawingml/2006/main">
+              <a:graphicData uri="http://schemas.openxmlformats.org/drawingml/2006/picture">
+                <pic:pic xmlns:pic="http://schemas.openxmlformats.org/drawingml/2006/picture">
+                  <pic:nvPicPr>
+                    <pic:cNvPr id="1" name=""/>
+                    <pic:cNvPicPr/>
+                  </pic:nvPicPr>
+                  <pic:blipFill>
+                    <a:blip r:embed="rId26"/>
+                    <a:stretch>
+                      <a:fillRect/>
+                    </a:stretch>
+                  </pic:blipFill>
+                  <pic:spPr>
+                    <a:xfrm>
+                      <a:off x="0" y="0"/>
+                      <a:ext cx="5939790" cy="4436110"/>
+                    </a:xfrm>
+                    <a:prstGeom prst="rect">
+                      <a:avLst/>
+                    </a:prstGeom>
+                  </pic:spPr>
+                </pic:pic>
+              </a:graphicData>
+            </a:graphic>
+          </wp:inline>
+        </w:drawing>
+      </w:r>
+    </w:p>
+    <w:p>
+      <w:pPr>
+        <w:pStyle w:val="SourceCode"/>
+      </w:pPr>
+      <w:r>
+        <w:rPr>
+          <w:noProof/>
+        </w:rPr>
+        <w:drawing>
+          <wp:inline distT="0" distB="0" distL="0" distR="0" wp14:anchorId="48A9E27A" wp14:editId="64B458EC">
+            <wp:extent cx="5939790" cy="2841625"/>
+            <wp:effectExtent l="0" t="0" r="0" b="0"/>
+            <wp:docPr id="18" name="Imagen 18"/>
+            <wp:cNvGraphicFramePr>
+              <a:graphicFrameLocks xmlns:a="http://schemas.openxmlformats.org/drawingml/2006/main" noChangeAspect="1"/>
+            </wp:cNvGraphicFramePr>
+            <a:graphic xmlns:a="http://schemas.openxmlformats.org/drawingml/2006/main">
+              <a:graphicData uri="http://schemas.openxmlformats.org/drawingml/2006/picture">
+                <pic:pic xmlns:pic="http://schemas.openxmlformats.org/drawingml/2006/picture">
+                  <pic:nvPicPr>
+                    <pic:cNvPr id="1" name=""/>
+                    <pic:cNvPicPr/>
+                  </pic:nvPicPr>
+                  <pic:blipFill>
+                    <a:blip r:embed="rId27"/>
+                    <a:stretch>
+                      <a:fillRect/>
+                    </a:stretch>
+                  </pic:blipFill>
+                  <pic:spPr>
+                    <a:xfrm>
+                      <a:off x="0" y="0"/>
+                      <a:ext cx="5939790" cy="2841625"/>
+                    </a:xfrm>
+                    <a:prstGeom prst="rect">
+                      <a:avLst/>
+                    </a:prstGeom>
+                  </pic:spPr>
+                </pic:pic>
+              </a:graphicData>
+            </a:graphic>
+          </wp:inline>
+        </w:drawing>
+      </w:r>
+    </w:p>
+    <w:p>
+      <w:pPr>
+        <w:pStyle w:val="SourceCode"/>
+      </w:pPr>
+      <w:r>
+        <w:rPr>
+          <w:noProof/>
+        </w:rPr>
+        <w:lastRenderedPageBreak/>
+        <w:drawing>
+          <wp:inline distT="0" distB="0" distL="0" distR="0" wp14:anchorId="005CFBB7" wp14:editId="42D3B3B7">
+            <wp:extent cx="5939790" cy="1251585"/>
+            <wp:effectExtent l="0" t="0" r="0" b="0"/>
+            <wp:docPr id="19" name="Imagen 19"/>
+            <wp:cNvGraphicFramePr>
+              <a:graphicFrameLocks xmlns:a="http://schemas.openxmlformats.org/drawingml/2006/main" noChangeAspect="1"/>
+            </wp:cNvGraphicFramePr>
+            <a:graphic xmlns:a="http://schemas.openxmlformats.org/drawingml/2006/main">
+              <a:graphicData uri="http://schemas.openxmlformats.org/drawingml/2006/picture">
+                <pic:pic xmlns:pic="http://schemas.openxmlformats.org/drawingml/2006/picture">
+                  <pic:nvPicPr>
+                    <pic:cNvPr id="1" name=""/>
+                    <pic:cNvPicPr/>
+                  </pic:nvPicPr>
+                  <pic:blipFill>
+                    <a:blip r:embed="rId28"/>
+                    <a:stretch>
+                      <a:fillRect/>
+                    </a:stretch>
+                  </pic:blipFill>
+                  <pic:spPr>
+                    <a:xfrm>
+                      <a:off x="0" y="0"/>
+                      <a:ext cx="5939790" cy="1251585"/>
+                    </a:xfrm>
+                    <a:prstGeom prst="rect">
+                      <a:avLst/>
+                    </a:prstGeom>
+                  </pic:spPr>
+                </pic:pic>
+              </a:graphicData>
+            </a:graphic>
+          </wp:inline>
+        </w:drawing>
+      </w:r>
+    </w:p>
+    <w:p>
+      <w:pPr>
+        <w:pStyle w:val="SourceCode"/>
+      </w:pPr>
+      <w:r>
+        <w:rPr>
+          <w:noProof/>
+        </w:rPr>
+        <w:drawing>
+          <wp:inline distT="0" distB="0" distL="0" distR="0" wp14:anchorId="12BBF79F" wp14:editId="288C364A">
+            <wp:extent cx="5939790" cy="1673225"/>
+            <wp:effectExtent l="0" t="0" r="0" b="0"/>
+            <wp:docPr id="20" name="Imagen 20"/>
+            <wp:cNvGraphicFramePr>
+              <a:graphicFrameLocks xmlns:a="http://schemas.openxmlformats.org/drawingml/2006/main" noChangeAspect="1"/>
+            </wp:cNvGraphicFramePr>
+            <a:graphic xmlns:a="http://schemas.openxmlformats.org/drawingml/2006/main">
+              <a:graphicData uri="http://schemas.openxmlformats.org/drawingml/2006/picture">
+                <pic:pic xmlns:pic="http://schemas.openxmlformats.org/drawingml/2006/picture">
+                  <pic:nvPicPr>
+                    <pic:cNvPr id="1" name=""/>
+                    <pic:cNvPicPr/>
+                  </pic:nvPicPr>
+                  <pic:blipFill>
+                    <a:blip r:embed="rId29"/>
+                    <a:stretch>
+                      <a:fillRect/>
+                    </a:stretch>
+                  </pic:blipFill>
+                  <pic:spPr>
+                    <a:xfrm>
+                      <a:off x="0" y="0"/>
+                      <a:ext cx="5939790" cy="1673225"/>
+                    </a:xfrm>
+                    <a:prstGeom prst="rect">
+                      <a:avLst/>
+                    </a:prstGeom>
+                  </pic:spPr>
+                </pic:pic>
+              </a:graphicData>
+            </a:graphic>
+          </wp:inline>
+        </w:drawing>
+      </w:r>
+    </w:p>
+    <w:p>
+      <w:pPr>
+        <w:pStyle w:val="FirstParagraph"/>
+      </w:pPr>
+      <w:r>
+        <w:t xml:space="preserve">En macOS, usa </w:t>
+      </w:r>
+      <w:proofErr w:type="spellStart"/>
+      <w:r>
+        <w:rPr>
+          <w:rStyle w:val="VerbatimChar"/>
+        </w:rPr>
+        <w:t>shasum</w:t>
+      </w:r>
+      <w:proofErr w:type="spellEnd"/>
+      <w:r>
+        <w:rPr>
+          <w:rStyle w:val="VerbatimChar"/>
+        </w:rPr>
+        <w:t xml:space="preserve"> -a 256</w:t>
+      </w:r>
+      <w:r>
+        <w:t xml:space="preserve"> en lugar de </w:t>
+      </w:r>
+      <w:r>
+        <w:rPr>
+          <w:rStyle w:val="VerbatimChar"/>
+        </w:rPr>
+        <w:t>sha256sum</w:t>
+      </w:r>
+      <w:r>
+        <w:t>.</w:t>
+      </w:r>
+    </w:p>
+    <w:p>
+      <w:pPr>
+        <w:pStyle w:val="Ttulo2"/>
+      </w:pPr>
+      <w:bookmarkStart w:id="15" w:name="paso-5-entrega-el-informe"/>
+      <w:bookmarkEnd w:id="14"/>
+      <w:r>
+        <w:t>Paso 5 · Entrega el informe</w:t>
+      </w:r>
+    </w:p>
+    <w:p>
+      <w:pPr>
+        <w:pStyle w:val="Compact"/>
+        <w:numPr>
+          <w:ilvl w:val="0"/>
+          <w:numId w:val="7"/>
+        </w:numPr>
+      </w:pPr>
+      <w:r>
+        <w:t xml:space="preserve">Abre </w:t>
+      </w:r>
+      <w:r>
+        <w:rPr>
+          <w:rStyle w:val="VerbatimChar"/>
+        </w:rPr>
+        <w:t>INFORME.md</w:t>
+      </w:r>
+      <w:r>
+        <w:t xml:space="preserve"> en tu repositorio de GitHub, pulsa </w:t>
+      </w:r>
+      <w:proofErr w:type="spellStart"/>
+      <w:r>
+        <w:rPr>
+          <w:b/>
+          <w:bCs/>
+        </w:rPr>
+        <w:t>Ctrl+P</w:t>
+      </w:r>
+      <w:proofErr w:type="spellEnd"/>
+      <w:r>
+        <w:t xml:space="preserve"> y elige </w:t>
+      </w:r>
+      <w:r>
+        <w:rPr>
+          <w:b/>
+          <w:bCs/>
+        </w:rPr>
+        <w:t>Guardar como PDF</w:t>
+      </w:r>
+      <w:r>
+        <w:t>.</w:t>
+      </w:r>
+    </w:p>
+    <w:p>
+      <w:pPr>
+        <w:pStyle w:val="Compact"/>
+        <w:numPr>
+          <w:ilvl w:val="0"/>
+          <w:numId w:val="7"/>
+        </w:numPr>
+      </w:pPr>
+      <w:r>
+        <w:t>Sube el PDF al aula virtual.</w:t>
+      </w:r>
+    </w:p>
+    <w:p>
+      <w:pPr>
+        <w:pStyle w:val="Compact"/>
+        <w:numPr>
+          <w:ilvl w:val="0"/>
+          <w:numId w:val="7"/>
+        </w:numPr>
+      </w:pPr>
+      <w:r>
+        <w:t xml:space="preserve">Apaga el servidor con </w:t>
+      </w:r>
+      <w:proofErr w:type="spellStart"/>
+      <w:r>
+        <w:rPr>
+          <w:rStyle w:val="VerbatimChar"/>
+        </w:rPr>
+        <w:t>docker</w:t>
+      </w:r>
+      <w:proofErr w:type="spellEnd"/>
+      <w:r>
+        <w:rPr>
+          <w:rStyle w:val="VerbatimChar"/>
+        </w:rPr>
+        <w:t xml:space="preserve"> </w:t>
+      </w:r>
+      <w:proofErr w:type="spellStart"/>
+      <w:r>
+        <w:rPr>
+          <w:rStyle w:val="VerbatimChar"/>
+        </w:rPr>
+        <w:t>compose</w:t>
+      </w:r>
+      <w:proofErr w:type="spellEnd"/>
+      <w:r>
+        <w:rPr>
+          <w:rStyle w:val="VerbatimChar"/>
+        </w:rPr>
+        <w:t xml:space="preserve"> </w:t>
+      </w:r>
+      <w:proofErr w:type="spellStart"/>
+      <w:r>
+        <w:rPr>
+          <w:rStyle w:val="VerbatimChar"/>
+        </w:rPr>
+        <w:t>down</w:t>
+      </w:r>
+      <w:proofErr w:type="spellEnd"/>
+      <w:r>
+        <w:rPr>
+          <w:rStyle w:val="VerbatimChar"/>
+        </w:rPr>
+        <w:t xml:space="preserve"> -v</w:t>
+      </w:r>
+      <w:r>
+        <w:t>.</w:t>
+      </w:r>
+    </w:p>
+    <w:p/>
+    <w:p>
+      <w:pPr>
+        <w:pStyle w:val="Ttulo2"/>
+      </w:pPr>
+      <w:bookmarkStart w:id="16" w:name="qué-entregas"/>
+      <w:bookmarkEnd w:id="15"/>
+      <w:r>
+        <w:t>Qué entregas</w:t>
+      </w:r>
+    </w:p>
+    <w:tbl>
+      <w:tblPr>
+        <w:tblStyle w:val="Table"/>
+        <w:tblW w:w="5000" w:type="pct"/>
+        <w:tblLayout w:type="fixed"/>
+        <w:tblLook w:val="0000" w:firstRow="0" w:lastRow="0" w:firstColumn="0" w:lastColumn="0" w:noHBand="0" w:noVBand="0"/>
+      </w:tblPr>
+      <w:tblGrid>
+        <w:gridCol w:w="4785"/>
+        <w:gridCol w:w="4785"/>
+      </w:tblGrid>
+      <w:tr>
+        <w:tc>
+          <w:tcPr>
+            <w:tcW w:w="3960" w:type="dxa"/>
+          </w:tcPr>
+          <w:p>
+            <w:pPr>
+              <w:pStyle w:val="Compact"/>
+            </w:pPr>
+            <w:r>
+              <w:rPr>
+                <w:b/>
+                <w:bCs/>
+              </w:rPr>
+              <w:t>Archivo</w:t>
+            </w:r>
+          </w:p>
+        </w:tc>
+        <w:tc>
+          <w:tcPr>
+            <w:tcW w:w="3960" w:type="dxa"/>
+          </w:tcPr>
+          <w:p>
+            <w:pPr>
+              <w:pStyle w:val="Compact"/>
+            </w:pPr>
+            <w:r>
+              <w:rPr>
+                <w:rStyle w:val="VerbatimChar"/>
+              </w:rPr>
+              <w:t>SI084-EXPRAC-U1-&lt;</w:t>
+            </w:r>
+            <w:proofErr w:type="spellStart"/>
+            <w:r>
+              <w:rPr>
+                <w:rStyle w:val="VerbatimChar"/>
+              </w:rPr>
+              <w:t>ApellidoNombre</w:t>
+            </w:r>
+            <w:proofErr w:type="spellEnd"/>
+            <w:r>
+              <w:rPr>
+                <w:rStyle w:val="VerbatimChar"/>
+              </w:rPr>
+              <w:t>&gt;.</w:t>
+            </w:r>
+            <w:proofErr w:type="spellStart"/>
+            <w:r>
+              <w:rPr>
+                <w:rStyle w:val="VerbatimChar"/>
+              </w:rPr>
+              <w:t>pdf</w:t>
+            </w:r>
+            <w:proofErr w:type="spellEnd"/>
+          </w:p>
+        </w:tc>
+      </w:tr>
+      <w:tr>
+        <w:tc>
+          <w:tcPr>
+            <w:tcW w:w="3960" w:type="dxa"/>
+          </w:tcPr>
+          <w:p>
+            <w:pPr>
+              <w:pStyle w:val="Compact"/>
+            </w:pPr>
+            <w:r>
+              <w:rPr>
+                <w:b/>
+                <w:bCs/>
+              </w:rPr>
+              <w:t>Dónde se sube</w:t>
+            </w:r>
+          </w:p>
+        </w:tc>
+        <w:tc>
+          <w:tcPr>
+            <w:tcW w:w="3960" w:type="dxa"/>
+          </w:tcPr>
+          <w:p>
+            <w:pPr>
+              <w:pStyle w:val="Compact"/>
+            </w:pPr>
+            <w:r>
+              <w:t>Aula virtual, tarea «Examen práctico · Unidad I»</w:t>
+            </w:r>
+          </w:p>
+        </w:tc>
+      </w:tr>
+      <w:tr>
+        <w:tc>
+          <w:tcPr>
+            <w:tcW w:w="3960" w:type="dxa"/>
+          </w:tcPr>
+          <w:p>
+            <w:pPr>
+              <w:pStyle w:val="Compact"/>
+            </w:pPr>
+            <w:proofErr w:type="gramStart"/>
+            <w:r>
+              <w:rPr>
+                <w:b/>
+                <w:bCs/>
+              </w:rPr>
+              <w:t>Cuándo</w:t>
+            </w:r>
+            <w:proofErr w:type="gramEnd"/>
+            <w:r>
+              <w:rPr>
+                <w:b/>
+                <w:bCs/>
+              </w:rPr>
+              <w:t xml:space="preserve"> vence</w:t>
+            </w:r>
+          </w:p>
+        </w:tc>
+        <w:tc>
+          <w:tcPr>
+            <w:tcW w:w="3960" w:type="dxa"/>
+          </w:tcPr>
+          <w:p>
+            <w:pPr>
+              <w:pStyle w:val="Compact"/>
+            </w:pPr>
+            <w:r>
+              <w:t>Al terminar los 40 minutos, en la sesión de laboratorio</w:t>
+            </w:r>
+          </w:p>
+        </w:tc>
+      </w:tr>
+      <w:tr>
+        <w:tc>
+          <w:tcPr>
+            <w:tcW w:w="3960" w:type="dxa"/>
+          </w:tcPr>
+          <w:p>
+            <w:pPr>
+              <w:pStyle w:val="Compact"/>
+            </w:pPr>
+            <w:r>
+              <w:rPr>
+                <w:b/>
+                <w:bCs/>
+              </w:rPr>
+              <w:t>Repositorio</w:t>
+            </w:r>
+          </w:p>
+        </w:tc>
+        <w:tc>
+          <w:tcPr>
+            <w:tcW w:w="3960" w:type="dxa"/>
+          </w:tcPr>
+          <w:p>
+            <w:pPr>
+              <w:pStyle w:val="Compact"/>
+            </w:pPr>
+            <w:r>
+              <w:rPr>
+                <w:rStyle w:val="VerbatimChar"/>
+              </w:rPr>
+              <w:t>si084-caso-coopac</w:t>
+            </w:r>
+            <w:r>
+              <w:t xml:space="preserve"> en tu cuenta de GitHub, con la etiqueta </w:t>
+            </w:r>
+            <w:r>
+              <w:rPr>
+                <w:rStyle w:val="VerbatimChar"/>
+              </w:rPr>
+              <w:t>examen-u1</w:t>
+            </w:r>
+            <w:r>
+              <w:t xml:space="preserve"> y la carpeta </w:t>
+            </w:r>
+            <w:r>
+              <w:rPr>
+                <w:rStyle w:val="VerbatimChar"/>
+              </w:rPr>
+              <w:t>evidencias/</w:t>
+            </w:r>
+            <w:r>
+              <w:t xml:space="preserve"> completa</w:t>
+            </w:r>
+          </w:p>
+        </w:tc>
+      </w:tr>
+    </w:tbl>
+    <w:p>
+      <w:pPr>
+        <w:pStyle w:val="Textodebloque"/>
+      </w:pPr>
+      <w:r>
+        <w:rPr>
+          <w:b/>
+          <w:bCs/>
+        </w:rPr>
+        <w:t>El informe es lo que se califica; el repositorio es lo que lo prueba.</w:t>
+      </w:r>
+      <w:r>
+        <w:t xml:space="preserve"> Un resultado sin su archivo en </w:t>
+      </w:r>
+      <w:r>
+        <w:rPr>
+          <w:rStyle w:val="VerbatimChar"/>
+        </w:rPr>
+        <w:t>evidencias/</w:t>
+      </w:r>
+      <w:r>
+        <w:t xml:space="preserve"> se califica como no logrado. No se califica un informe sin la URL del repositorio en la carátula.</w:t>
+      </w:r>
+    </w:p>
+    <w:p>
+      <w:r>
+        <w:rPr>
+          <w:noProof/>
+        </w:rPr>
+        <w:pict w14:anchorId="2D096890">
+          <v:rect id="_x0000_i1025" alt="" style="width:467.55pt;height:.05pt;mso-width-percent:0;mso-height-percent:0;mso-width-percent:0;mso-height-percent:0" o:hrpct="999" o:hralign="center" o:hrstd="t" o:hr="t"/>
+        </w:pict>
+      </w:r>
+    </w:p>
+    <w:p>
+      <w:pPr>
+        <w:pStyle w:val="Ttulo2"/>
+      </w:pPr>
+      <w:bookmarkStart w:id="17" w:name="cómo-se-califica"/>
+      <w:bookmarkEnd w:id="16"/>
+      <w:r>
+        <w:t>Cómo se califica</w:t>
       </w:r>
     </w:p>
     <w:tbl>
@@ -4150,7 +6239,7 @@
               <w:pStyle w:val="Compact"/>
             </w:pPr>
             <w:r>
-              <w:t>Elemento</w:t>
+              <w:t>Qué</w:t>
             </w:r>
           </w:p>
         </w:tc>
@@ -4163,7 +6252,7 @@
               <w:pStyle w:val="Compact"/>
             </w:pPr>
             <w:r>
-              <w:t>Qué escribes</w:t>
+              <w:t>Puntos</w:t>
             </w:r>
           </w:p>
         </w:tc>
@@ -4178,7 +6267,7 @@
               <w:pStyle w:val="Compact"/>
             </w:pPr>
             <w:r>
-              <w:t>Título</w:t>
+              <w:t>P1, P2, P3 y P6 · resultado correcto y ¿Cumple? bien marcado</w:t>
             </w:r>
           </w:p>
         </w:tc>
@@ -4191,7 +6280,7 @@
               <w:pStyle w:val="Compact"/>
             </w:pPr>
             <w:r>
-              <w:t>El problema en una línea</w:t>
+              <w:t>1 cada uno, 4 en total</w:t>
             </w:r>
           </w:p>
         </w:tc>
@@ -4206,7 +6295,7 @@
               <w:pStyle w:val="Compact"/>
             </w:pPr>
             <w:r>
-              <w:t>Condición</w:t>
+              <w:t>P4 · las dos cifras de cesados y las dos de cuentas sin responsable</w:t>
             </w:r>
           </w:p>
         </w:tc>
@@ -4219,7 +6308,7 @@
               <w:pStyle w:val="Compact"/>
             </w:pPr>
             <w:r>
-              <w:t>Lo que encontraste, con cifras y el archivo de evidencia</w:t>
+              <w:t>2</w:t>
             </w:r>
           </w:p>
         </w:tc>
@@ -4234,7 +6323,7 @@
               <w:pStyle w:val="Compact"/>
             </w:pPr>
             <w:r>
-              <w:t>Criterio</w:t>
+              <w:t>P5 · condición SQL correcta, con casos, monto y usuarios</w:t>
             </w:r>
           </w:p>
         </w:tc>
@@ -4247,7 +6336,7 @@
               <w:pStyle w:val="Compact"/>
             </w:pPr>
             <w:r>
-              <w:t>La regla de la política y su control de referencia, con el código</w:t>
+              <w:t>2</w:t>
             </w:r>
           </w:p>
         </w:tc>
@@ -4263,7 +6352,7 @@
             </w:pPr>
             <w:r>
               <w:lastRenderedPageBreak/>
-              <w:t>Causa</w:t>
+              <w:t>P7 · restauración ejecutada, tabla faltante y días sin respaldo</w:t>
             </w:r>
           </w:p>
         </w:tc>
@@ -4276,7 +6365,7 @@
               <w:pStyle w:val="Compact"/>
             </w:pPr>
             <w:r>
-              <w:t>Por qué ocurre, según lo que viste en los archivos del paquete. «Falta de control» no es una causa</w:t>
+              <w:t>2</w:t>
             </w:r>
           </w:p>
         </w:tc>
@@ -4291,7 +6380,7 @@
               <w:pStyle w:val="Compact"/>
             </w:pPr>
             <w:r>
-              <w:t>Efecto</w:t>
+              <w:t>Hallazgo 1 · condición con cifras, criterio con código, causa con evidencia, efecto y recomendación</w:t>
             </w:r>
           </w:p>
         </w:tc>
@@ -4304,7 +6393,7 @@
               <w:pStyle w:val="Compact"/>
             </w:pPr>
             <w:r>
-              <w:t>Qué le puede pasar a la cooperativa, en soles, cuentas o días</w:t>
+              <w:t>4</w:t>
             </w:r>
           </w:p>
         </w:tc>
@@ -4319,7 +6408,7 @@
               <w:pStyle w:val="Compact"/>
             </w:pPr>
             <w:r>
-              <w:t>Recomendación</w:t>
+              <w:t>Hallazgo 2 · lo mismo</w:t>
             </w:r>
           </w:p>
         </w:tc>
@@ -4332,743 +6421,8 @@
               <w:pStyle w:val="Compact"/>
             </w:pPr>
             <w:r>
-              <w:t>Qué hacer, quién lo hace y en qué plazo</w:t>
-            </w:r>
-          </w:p>
-        </w:tc>
-      </w:tr>
-    </w:tbl>
-    <w:p>
-      <w:pPr>
-        <w:pStyle w:val="Ttulo2"/>
-      </w:pPr>
-      <w:bookmarkStart w:id="14" w:name="paso-4-sube-tu-evidencia-a-github"/>
-      <w:bookmarkEnd w:id="13"/>
-      <w:r>
-        <w:t>Paso 4 · Sube tu evidencia a GitHub</w:t>
-      </w:r>
-    </w:p>
-    <w:p>
-      <w:pPr>
-        <w:pStyle w:val="Compact"/>
-        <w:numPr>
-          <w:ilvl w:val="0"/>
-          <w:numId w:val="7"/>
-        </w:numPr>
-      </w:pPr>
-      <w:r>
-        <w:t xml:space="preserve">Crea en https://github.com/new un repositorio </w:t>
-      </w:r>
-      <w:r>
-        <w:rPr>
-          <w:b/>
-          <w:bCs/>
-        </w:rPr>
-        <w:t>público y vacío</w:t>
-      </w:r>
-      <w:r>
-        <w:t xml:space="preserve"> llamado </w:t>
-      </w:r>
-      <w:r>
-        <w:rPr>
-          <w:rStyle w:val="VerbatimChar"/>
-        </w:rPr>
-        <w:t>si084-caso-coopac</w:t>
-      </w:r>
-      <w:r>
-        <w:t>.</w:t>
-      </w:r>
-    </w:p>
-    <w:p>
-      <w:pPr>
-        <w:pStyle w:val="Compact"/>
-        <w:numPr>
-          <w:ilvl w:val="0"/>
-          <w:numId w:val="7"/>
-        </w:numPr>
-      </w:pPr>
-      <w:r>
-        <w:t xml:space="preserve">Escribe en la carátula de </w:t>
-      </w:r>
-      <w:r>
-        <w:rPr>
-          <w:rStyle w:val="VerbatimChar"/>
-        </w:rPr>
-        <w:t>INFORME.md</w:t>
-      </w:r>
-      <w:r>
-        <w:t xml:space="preserve"> tu nombre, tu código y la URL </w:t>
-      </w:r>
-      <w:r>
-        <w:rPr>
-          <w:rStyle w:val="VerbatimChar"/>
-        </w:rPr>
-        <w:t>https://github.com/&lt;usuario&gt;/si084-caso-coopac/tree/examen-u1</w:t>
-      </w:r>
-      <w:r>
-        <w:t>.</w:t>
-      </w:r>
-    </w:p>
-    <w:p>
-      <w:pPr>
-        <w:pStyle w:val="Compact"/>
-        <w:numPr>
-          <w:ilvl w:val="0"/>
-          <w:numId w:val="7"/>
-        </w:numPr>
-      </w:pPr>
-      <w:r>
-        <w:t xml:space="preserve">Sella la evidencia, sube el repositorio y crea la etiqueta </w:t>
-      </w:r>
-      <w:r>
-        <w:rPr>
-          <w:rStyle w:val="VerbatimChar"/>
-        </w:rPr>
-        <w:t>examen-u1</w:t>
-      </w:r>
-      <w:r>
-        <w:t xml:space="preserve">. Cambia </w:t>
-      </w:r>
-      <w:r>
-        <w:rPr>
-          <w:rStyle w:val="VerbatimChar"/>
-        </w:rPr>
-        <w:t>&lt;usuario&gt;</w:t>
-      </w:r>
-      <w:r>
-        <w:t xml:space="preserve"> por tu usuario de GitHub.</w:t>
-      </w:r>
-    </w:p>
-    <w:p>
-      <w:pPr>
-        <w:pStyle w:val="SourceCode"/>
-      </w:pPr>
-      <w:r>
-        <w:rPr>
-          <w:rStyle w:val="FunctionTok"/>
-        </w:rPr>
-        <w:t>sha256sum</w:t>
-      </w:r>
-      <w:r>
-        <w:rPr>
-          <w:rStyle w:val="NormalTok"/>
-        </w:rPr>
-        <w:t xml:space="preserve"> evidencias/</w:t>
-      </w:r>
-      <w:r>
-        <w:rPr>
-          <w:rStyle w:val="PreprocessorTok"/>
-        </w:rPr>
-        <w:t>*</w:t>
-      </w:r>
-      <w:r>
-        <w:rPr>
-          <w:rStyle w:val="NormalTok"/>
-        </w:rPr>
-        <w:t>.</w:t>
-      </w:r>
-      <w:proofErr w:type="spellStart"/>
-      <w:r>
-        <w:rPr>
-          <w:rStyle w:val="NormalTok"/>
-        </w:rPr>
-        <w:t>txt</w:t>
-      </w:r>
-      <w:proofErr w:type="spellEnd"/>
-      <w:r>
-        <w:rPr>
-          <w:rStyle w:val="NormalTok"/>
-        </w:rPr>
-        <w:t xml:space="preserve"> </w:t>
-      </w:r>
-      <w:r>
-        <w:rPr>
-          <w:rStyle w:val="OperatorTok"/>
-        </w:rPr>
-        <w:t>&gt;</w:t>
-      </w:r>
-      <w:r>
-        <w:rPr>
-          <w:rStyle w:val="NormalTok"/>
-        </w:rPr>
-        <w:t xml:space="preserve"> evidencias/SHA256SUMS.txt</w:t>
-      </w:r>
-      <w:r>
-        <w:br/>
-      </w:r>
-      <w:proofErr w:type="spellStart"/>
-      <w:r>
-        <w:rPr>
-          <w:rStyle w:val="FunctionTok"/>
-        </w:rPr>
-        <w:t>git</w:t>
-      </w:r>
-      <w:proofErr w:type="spellEnd"/>
-      <w:r>
-        <w:rPr>
-          <w:rStyle w:val="NormalTok"/>
-        </w:rPr>
-        <w:t xml:space="preserve"> </w:t>
-      </w:r>
-      <w:proofErr w:type="spellStart"/>
-      <w:r>
-        <w:rPr>
-          <w:rStyle w:val="NormalTok"/>
-        </w:rPr>
-        <w:t>init</w:t>
-      </w:r>
-      <w:proofErr w:type="spellEnd"/>
-      <w:r>
-        <w:rPr>
-          <w:rStyle w:val="NormalTok"/>
-        </w:rPr>
-        <w:t xml:space="preserve"> </w:t>
-      </w:r>
-      <w:r>
-        <w:rPr>
-          <w:rStyle w:val="AttributeTok"/>
-        </w:rPr>
-        <w:t>-b</w:t>
-      </w:r>
-      <w:r>
-        <w:rPr>
-          <w:rStyle w:val="NormalTok"/>
-        </w:rPr>
-        <w:t xml:space="preserve"> </w:t>
-      </w:r>
-      <w:proofErr w:type="spellStart"/>
-      <w:r>
-        <w:rPr>
-          <w:rStyle w:val="NormalTok"/>
-        </w:rPr>
-        <w:t>main</w:t>
-      </w:r>
-      <w:proofErr w:type="spellEnd"/>
-      <w:r>
-        <w:br/>
-      </w:r>
-      <w:proofErr w:type="spellStart"/>
-      <w:r>
-        <w:rPr>
-          <w:rStyle w:val="FunctionTok"/>
-        </w:rPr>
-        <w:t>git</w:t>
-      </w:r>
-      <w:proofErr w:type="spellEnd"/>
-      <w:r>
-        <w:rPr>
-          <w:rStyle w:val="NormalTok"/>
-        </w:rPr>
-        <w:t xml:space="preserve"> </w:t>
-      </w:r>
-      <w:proofErr w:type="spellStart"/>
-      <w:proofErr w:type="gramStart"/>
-      <w:r>
-        <w:rPr>
-          <w:rStyle w:val="NormalTok"/>
-        </w:rPr>
-        <w:t>add</w:t>
-      </w:r>
-      <w:proofErr w:type="spellEnd"/>
-      <w:r>
-        <w:rPr>
-          <w:rStyle w:val="NormalTok"/>
-        </w:rPr>
-        <w:t xml:space="preserve"> .</w:t>
-      </w:r>
-      <w:proofErr w:type="gramEnd"/>
-      <w:r>
-        <w:br/>
-      </w:r>
-      <w:proofErr w:type="spellStart"/>
-      <w:r>
-        <w:rPr>
-          <w:rStyle w:val="FunctionTok"/>
-        </w:rPr>
-        <w:t>git</w:t>
-      </w:r>
-      <w:proofErr w:type="spellEnd"/>
-      <w:r>
-        <w:rPr>
-          <w:rStyle w:val="NormalTok"/>
-        </w:rPr>
-        <w:t xml:space="preserve"> </w:t>
-      </w:r>
-      <w:proofErr w:type="spellStart"/>
-      <w:r>
-        <w:rPr>
-          <w:rStyle w:val="NormalTok"/>
-        </w:rPr>
-        <w:t>commit</w:t>
-      </w:r>
-      <w:proofErr w:type="spellEnd"/>
-      <w:r>
-        <w:rPr>
-          <w:rStyle w:val="NormalTok"/>
-        </w:rPr>
-        <w:t xml:space="preserve"> </w:t>
-      </w:r>
-      <w:r>
-        <w:rPr>
-          <w:rStyle w:val="AttributeTok"/>
-        </w:rPr>
-        <w:t>-m</w:t>
-      </w:r>
-      <w:r>
-        <w:rPr>
-          <w:rStyle w:val="NormalTok"/>
-        </w:rPr>
-        <w:t xml:space="preserve"> </w:t>
-      </w:r>
-      <w:r>
-        <w:rPr>
-          <w:rStyle w:val="StringTok"/>
-        </w:rPr>
-        <w:t>"Caso COOPAC · examen práctico U1"</w:t>
-      </w:r>
-      <w:r>
-        <w:br/>
-      </w:r>
-      <w:proofErr w:type="spellStart"/>
-      <w:r>
-        <w:rPr>
-          <w:rStyle w:val="FunctionTok"/>
-        </w:rPr>
-        <w:t>git</w:t>
-      </w:r>
-      <w:proofErr w:type="spellEnd"/>
-      <w:r>
-        <w:rPr>
-          <w:rStyle w:val="NormalTok"/>
-        </w:rPr>
-        <w:t xml:space="preserve"> </w:t>
-      </w:r>
-      <w:proofErr w:type="spellStart"/>
-      <w:r>
-        <w:rPr>
-          <w:rStyle w:val="NormalTok"/>
-        </w:rPr>
-        <w:t>remote</w:t>
-      </w:r>
-      <w:proofErr w:type="spellEnd"/>
-      <w:r>
-        <w:rPr>
-          <w:rStyle w:val="NormalTok"/>
-        </w:rPr>
-        <w:t xml:space="preserve"> </w:t>
-      </w:r>
-      <w:proofErr w:type="spellStart"/>
-      <w:r>
-        <w:rPr>
-          <w:rStyle w:val="NormalTok"/>
-        </w:rPr>
-        <w:t>add</w:t>
-      </w:r>
-      <w:proofErr w:type="spellEnd"/>
-      <w:r>
-        <w:rPr>
-          <w:rStyle w:val="NormalTok"/>
-        </w:rPr>
-        <w:t xml:space="preserve"> </w:t>
-      </w:r>
-      <w:proofErr w:type="spellStart"/>
-      <w:r>
-        <w:rPr>
-          <w:rStyle w:val="NormalTok"/>
-        </w:rPr>
-        <w:t>origin</w:t>
-      </w:r>
-      <w:proofErr w:type="spellEnd"/>
-      <w:r>
-        <w:rPr>
-          <w:rStyle w:val="NormalTok"/>
-        </w:rPr>
-        <w:t xml:space="preserve"> https://github.com/</w:t>
-      </w:r>
-      <w:r>
-        <w:rPr>
-          <w:rStyle w:val="OperatorTok"/>
-        </w:rPr>
-        <w:t>&lt;</w:t>
-      </w:r>
-      <w:r>
-        <w:rPr>
-          <w:rStyle w:val="NormalTok"/>
-        </w:rPr>
-        <w:t>usuario</w:t>
-      </w:r>
-      <w:r>
-        <w:rPr>
-          <w:rStyle w:val="OperatorTok"/>
-        </w:rPr>
-        <w:t>&gt;</w:t>
-      </w:r>
-      <w:r>
-        <w:rPr>
-          <w:rStyle w:val="NormalTok"/>
-        </w:rPr>
-        <w:t>/si084-caso-coopac.git</w:t>
-      </w:r>
-      <w:r>
-        <w:br/>
-      </w:r>
-      <w:proofErr w:type="spellStart"/>
-      <w:r>
-        <w:rPr>
-          <w:rStyle w:val="FunctionTok"/>
-        </w:rPr>
-        <w:t>git</w:t>
-      </w:r>
-      <w:proofErr w:type="spellEnd"/>
-      <w:r>
-        <w:rPr>
-          <w:rStyle w:val="NormalTok"/>
-        </w:rPr>
-        <w:t xml:space="preserve"> </w:t>
-      </w:r>
-      <w:proofErr w:type="spellStart"/>
-      <w:r>
-        <w:rPr>
-          <w:rStyle w:val="NormalTok"/>
-        </w:rPr>
-        <w:t>push</w:t>
-      </w:r>
-      <w:proofErr w:type="spellEnd"/>
-      <w:r>
-        <w:rPr>
-          <w:rStyle w:val="NormalTok"/>
-        </w:rPr>
-        <w:t xml:space="preserve"> </w:t>
-      </w:r>
-      <w:r>
-        <w:rPr>
-          <w:rStyle w:val="AttributeTok"/>
-        </w:rPr>
-        <w:t>-u</w:t>
-      </w:r>
-      <w:r>
-        <w:rPr>
-          <w:rStyle w:val="NormalTok"/>
-        </w:rPr>
-        <w:t xml:space="preserve"> </w:t>
-      </w:r>
-      <w:proofErr w:type="spellStart"/>
-      <w:r>
-        <w:rPr>
-          <w:rStyle w:val="NormalTok"/>
-        </w:rPr>
-        <w:t>origin</w:t>
-      </w:r>
-      <w:proofErr w:type="spellEnd"/>
-      <w:r>
-        <w:rPr>
-          <w:rStyle w:val="NormalTok"/>
-        </w:rPr>
-        <w:t xml:space="preserve"> </w:t>
-      </w:r>
-      <w:proofErr w:type="spellStart"/>
-      <w:r>
-        <w:rPr>
-          <w:rStyle w:val="NormalTok"/>
-        </w:rPr>
-        <w:t>main</w:t>
-      </w:r>
-      <w:proofErr w:type="spellEnd"/>
-      <w:r>
-        <w:br/>
-      </w:r>
-      <w:proofErr w:type="spellStart"/>
-      <w:r>
-        <w:rPr>
-          <w:rStyle w:val="FunctionTok"/>
-        </w:rPr>
-        <w:t>git</w:t>
-      </w:r>
-      <w:proofErr w:type="spellEnd"/>
-      <w:r>
-        <w:rPr>
-          <w:rStyle w:val="NormalTok"/>
-        </w:rPr>
-        <w:t xml:space="preserve"> tag examen-u1</w:t>
-      </w:r>
-      <w:r>
-        <w:br/>
-      </w:r>
-      <w:proofErr w:type="spellStart"/>
-      <w:r>
-        <w:rPr>
-          <w:rStyle w:val="FunctionTok"/>
-        </w:rPr>
-        <w:t>git</w:t>
-      </w:r>
-      <w:proofErr w:type="spellEnd"/>
-      <w:r>
-        <w:rPr>
-          <w:rStyle w:val="NormalTok"/>
-        </w:rPr>
-        <w:t xml:space="preserve"> </w:t>
-      </w:r>
-      <w:proofErr w:type="spellStart"/>
-      <w:r>
-        <w:rPr>
-          <w:rStyle w:val="NormalTok"/>
-        </w:rPr>
-        <w:t>push</w:t>
-      </w:r>
-      <w:proofErr w:type="spellEnd"/>
-      <w:r>
-        <w:rPr>
-          <w:rStyle w:val="NormalTok"/>
-        </w:rPr>
-        <w:t xml:space="preserve"> </w:t>
-      </w:r>
-      <w:proofErr w:type="spellStart"/>
-      <w:r>
-        <w:rPr>
-          <w:rStyle w:val="NormalTok"/>
-        </w:rPr>
-        <w:t>origin</w:t>
-      </w:r>
-      <w:proofErr w:type="spellEnd"/>
-      <w:r>
-        <w:rPr>
-          <w:rStyle w:val="NormalTok"/>
-        </w:rPr>
-        <w:t xml:space="preserve"> examen-u1</w:t>
-      </w:r>
-    </w:p>
-    <w:p>
-      <w:pPr>
-        <w:pStyle w:val="FirstParagraph"/>
-      </w:pPr>
-      <w:r>
-        <w:t xml:space="preserve">En macOS, usa </w:t>
-      </w:r>
-      <w:proofErr w:type="spellStart"/>
-      <w:r>
-        <w:rPr>
-          <w:rStyle w:val="VerbatimChar"/>
-        </w:rPr>
-        <w:t>shasum</w:t>
-      </w:r>
-      <w:proofErr w:type="spellEnd"/>
-      <w:r>
-        <w:rPr>
-          <w:rStyle w:val="VerbatimChar"/>
-        </w:rPr>
-        <w:t xml:space="preserve"> -a 256</w:t>
-      </w:r>
-      <w:r>
-        <w:t xml:space="preserve"> en lugar de </w:t>
-      </w:r>
-      <w:r>
-        <w:rPr>
-          <w:rStyle w:val="VerbatimChar"/>
-        </w:rPr>
-        <w:t>sha256sum</w:t>
-      </w:r>
-      <w:r>
-        <w:t>.</w:t>
-      </w:r>
-    </w:p>
-    <w:p>
-      <w:pPr>
-        <w:pStyle w:val="Ttulo2"/>
-      </w:pPr>
-      <w:bookmarkStart w:id="15" w:name="paso-5-entrega-el-informe"/>
-      <w:bookmarkEnd w:id="14"/>
-      <w:r>
-        <w:t>Paso 5 · Entrega el informe</w:t>
-      </w:r>
-    </w:p>
-    <w:p>
-      <w:pPr>
-        <w:pStyle w:val="Compact"/>
-        <w:numPr>
-          <w:ilvl w:val="0"/>
-          <w:numId w:val="7"/>
-        </w:numPr>
-      </w:pPr>
-      <w:r>
-        <w:t xml:space="preserve">Abre </w:t>
-      </w:r>
-      <w:r>
-        <w:rPr>
-          <w:rStyle w:val="VerbatimChar"/>
-        </w:rPr>
-        <w:t>INFORME.md</w:t>
-      </w:r>
-      <w:r>
-        <w:t xml:space="preserve"> en tu repositorio de GitHub, pulsa </w:t>
-      </w:r>
-      <w:proofErr w:type="spellStart"/>
-      <w:r>
-        <w:rPr>
-          <w:b/>
-          <w:bCs/>
-        </w:rPr>
-        <w:t>Ctrl+P</w:t>
-      </w:r>
-      <w:proofErr w:type="spellEnd"/>
-      <w:r>
-        <w:t xml:space="preserve"> y elige </w:t>
-      </w:r>
-      <w:r>
-        <w:rPr>
-          <w:b/>
-          <w:bCs/>
-        </w:rPr>
-        <w:t>Guardar como PDF</w:t>
-      </w:r>
-      <w:r>
-        <w:t>.</w:t>
-      </w:r>
-    </w:p>
-    <w:p>
-      <w:pPr>
-        <w:pStyle w:val="Compact"/>
-        <w:numPr>
-          <w:ilvl w:val="0"/>
-          <w:numId w:val="7"/>
-        </w:numPr>
-      </w:pPr>
-      <w:r>
-        <w:t>Sube el PDF al aula virtual.</w:t>
-      </w:r>
-    </w:p>
-    <w:p>
-      <w:pPr>
-        <w:pStyle w:val="Compact"/>
-        <w:numPr>
-          <w:ilvl w:val="0"/>
-          <w:numId w:val="7"/>
-        </w:numPr>
-      </w:pPr>
-      <w:r>
-        <w:t xml:space="preserve">Apaga el servidor con </w:t>
-      </w:r>
-      <w:proofErr w:type="spellStart"/>
-      <w:r>
-        <w:rPr>
-          <w:rStyle w:val="VerbatimChar"/>
-        </w:rPr>
-        <w:t>docker</w:t>
-      </w:r>
-      <w:proofErr w:type="spellEnd"/>
-      <w:r>
-        <w:rPr>
-          <w:rStyle w:val="VerbatimChar"/>
-        </w:rPr>
-        <w:t xml:space="preserve"> </w:t>
-      </w:r>
-      <w:proofErr w:type="spellStart"/>
-      <w:r>
-        <w:rPr>
-          <w:rStyle w:val="VerbatimChar"/>
-        </w:rPr>
-        <w:t>compose</w:t>
-      </w:r>
-      <w:proofErr w:type="spellEnd"/>
-      <w:r>
-        <w:rPr>
-          <w:rStyle w:val="VerbatimChar"/>
-        </w:rPr>
-        <w:t xml:space="preserve"> </w:t>
-      </w:r>
-      <w:proofErr w:type="spellStart"/>
-      <w:r>
-        <w:rPr>
-          <w:rStyle w:val="VerbatimChar"/>
-        </w:rPr>
-        <w:t>down</w:t>
-      </w:r>
-      <w:proofErr w:type="spellEnd"/>
-      <w:r>
-        <w:rPr>
-          <w:rStyle w:val="VerbatimChar"/>
-        </w:rPr>
-        <w:t xml:space="preserve"> -v</w:t>
-      </w:r>
-      <w:r>
-        <w:t>.</w:t>
-      </w:r>
-    </w:p>
-    <w:p/>
-    <w:p>
-      <w:pPr>
-        <w:pStyle w:val="Ttulo2"/>
-      </w:pPr>
-      <w:bookmarkStart w:id="16" w:name="qué-entregas"/>
-      <w:bookmarkEnd w:id="15"/>
-      <w:r>
-        <w:t>Qué entregas</w:t>
-      </w:r>
-    </w:p>
-    <w:tbl>
-      <w:tblPr>
-        <w:tblStyle w:val="Table"/>
-        <w:tblW w:w="5000" w:type="pct"/>
-        <w:tblLayout w:type="fixed"/>
-        <w:tblLook w:val="0000" w:firstRow="0" w:lastRow="0" w:firstColumn="0" w:lastColumn="0" w:noHBand="0" w:noVBand="0"/>
-      </w:tblPr>
-      <w:tblGrid>
-        <w:gridCol w:w="4785"/>
-        <w:gridCol w:w="4785"/>
-      </w:tblGrid>
-      <w:tr>
-        <w:tc>
-          <w:tcPr>
-            <w:tcW w:w="3960" w:type="dxa"/>
-          </w:tcPr>
-          <w:p>
-            <w:pPr>
-              <w:pStyle w:val="Compact"/>
-            </w:pPr>
-            <w:r>
-              <w:rPr>
-                <w:b/>
-                <w:bCs/>
-              </w:rPr>
-              <w:t>Archivo</w:t>
-            </w:r>
-          </w:p>
-        </w:tc>
-        <w:tc>
-          <w:tcPr>
-            <w:tcW w:w="3960" w:type="dxa"/>
-          </w:tcPr>
-          <w:p>
-            <w:pPr>
-              <w:pStyle w:val="Compact"/>
-            </w:pPr>
-            <w:r>
-              <w:rPr>
-                <w:rStyle w:val="VerbatimChar"/>
-              </w:rPr>
-              <w:t>SI084-EXPRAC-U1-&lt;</w:t>
-            </w:r>
-            <w:proofErr w:type="spellStart"/>
-            <w:r>
-              <w:rPr>
-                <w:rStyle w:val="VerbatimChar"/>
-              </w:rPr>
-              <w:t>ApellidoNombre</w:t>
-            </w:r>
-            <w:proofErr w:type="spellEnd"/>
-            <w:r>
-              <w:rPr>
-                <w:rStyle w:val="VerbatimChar"/>
-              </w:rPr>
-              <w:t>&gt;.</w:t>
-            </w:r>
-            <w:proofErr w:type="spellStart"/>
-            <w:r>
-              <w:rPr>
-                <w:rStyle w:val="VerbatimChar"/>
-              </w:rPr>
-              <w:t>pdf</w:t>
-            </w:r>
-            <w:proofErr w:type="spellEnd"/>
+              <w:t>4</w:t>
+            </w:r>
           </w:p>
         </w:tc>
       </w:tr>
@@ -5082,11 +6436,13 @@
               <w:pStyle w:val="Compact"/>
             </w:pPr>
             <w:r>
+              <w:t xml:space="preserve">Repositorio con la etiqueta, las evidencias y </w:t>
+            </w:r>
+            <w:r>
               <w:rPr>
-                <w:b/>
-                <w:bCs/>
+                <w:rStyle w:val="VerbatimChar"/>
               </w:rPr>
-              <w:t>Dónde se sube</w:t>
+              <w:t>SHA256SUMS.txt</w:t>
             </w:r>
           </w:p>
         </w:tc>
@@ -5099,7 +6455,7 @@
               <w:pStyle w:val="Compact"/>
             </w:pPr>
             <w:r>
-              <w:t>Aula virtual, tarea «Examen práctico · Unidad I»</w:t>
+              <w:t>2</w:t>
             </w:r>
           </w:p>
         </w:tc>
@@ -5113,21 +6469,12 @@
             <w:pPr>
               <w:pStyle w:val="Compact"/>
             </w:pPr>
-            <w:proofErr w:type="gramStart"/>
             <w:r>
               <w:rPr>
                 <w:b/>
                 <w:bCs/>
               </w:rPr>
-              <w:t>Cuándo</w:t>
-            </w:r>
-            <w:proofErr w:type="gramEnd"/>
-            <w:r>
-              <w:rPr>
-                <w:b/>
-                <w:bCs/>
-              </w:rPr>
-              <w:t xml:space="preserve"> vence</w:t>
+              <w:t>Total</w:t>
             </w:r>
           </w:p>
         </w:tc>
@@ -5140,389 +6487,6 @@
               <w:pStyle w:val="Compact"/>
             </w:pPr>
             <w:r>
-              <w:t>Al terminar los 40 minutos, en la sesión de laboratorio</w:t>
-            </w:r>
-          </w:p>
-        </w:tc>
-      </w:tr>
-      <w:tr>
-        <w:tc>
-          <w:tcPr>
-            <w:tcW w:w="3960" w:type="dxa"/>
-          </w:tcPr>
-          <w:p>
-            <w:pPr>
-              <w:pStyle w:val="Compact"/>
-            </w:pPr>
-            <w:r>
-              <w:rPr>
-                <w:b/>
-                <w:bCs/>
-              </w:rPr>
-              <w:t>Repositorio</w:t>
-            </w:r>
-          </w:p>
-        </w:tc>
-        <w:tc>
-          <w:tcPr>
-            <w:tcW w:w="3960" w:type="dxa"/>
-          </w:tcPr>
-          <w:p>
-            <w:pPr>
-              <w:pStyle w:val="Compact"/>
-            </w:pPr>
-            <w:r>
-              <w:rPr>
-                <w:rStyle w:val="VerbatimChar"/>
-              </w:rPr>
-              <w:t>si084-caso-coopac</w:t>
-            </w:r>
-            <w:r>
-              <w:t xml:space="preserve"> en tu cuenta de GitHub, con la etiqueta </w:t>
-            </w:r>
-            <w:r>
-              <w:rPr>
-                <w:rStyle w:val="VerbatimChar"/>
-              </w:rPr>
-              <w:t>examen-u1</w:t>
-            </w:r>
-            <w:r>
-              <w:t xml:space="preserve"> y la carpeta </w:t>
-            </w:r>
-            <w:r>
-              <w:rPr>
-                <w:rStyle w:val="VerbatimChar"/>
-              </w:rPr>
-              <w:t>evidencias/</w:t>
-            </w:r>
-            <w:r>
-              <w:t xml:space="preserve"> completa</w:t>
-            </w:r>
-          </w:p>
-        </w:tc>
-      </w:tr>
-    </w:tbl>
-    <w:p>
-      <w:pPr>
-        <w:pStyle w:val="Textodebloque"/>
-      </w:pPr>
-      <w:r>
-        <w:rPr>
-          <w:b/>
-          <w:bCs/>
-        </w:rPr>
-        <w:t>El informe es lo que se califica; el repositorio es lo que lo prueba.</w:t>
-      </w:r>
-      <w:r>
-        <w:t xml:space="preserve"> Un resultado sin su archivo en </w:t>
-      </w:r>
-      <w:r>
-        <w:rPr>
-          <w:rStyle w:val="VerbatimChar"/>
-        </w:rPr>
-        <w:t>evidencias/</w:t>
-      </w:r>
-      <w:r>
-        <w:t xml:space="preserve"> se califica como no logrado. No se califica un informe sin la URL del repositorio en la carátula.</w:t>
-      </w:r>
-    </w:p>
-    <w:p>
-      <w:r>
-        <w:rPr>
-          <w:noProof/>
-        </w:rPr>
-        <w:pict w14:anchorId="2D096890">
-          <v:rect id="_x0000_i1025" alt="" style="width:467.55pt;height:.05pt;mso-width-percent:0;mso-height-percent:0;mso-width-percent:0;mso-height-percent:0" o:hrpct="999" o:hralign="center" o:hrstd="t" o:hr="t"/>
-        </w:pict>
-      </w:r>
-    </w:p>
-    <w:p>
-      <w:pPr>
-        <w:pStyle w:val="Ttulo2"/>
-      </w:pPr>
-      <w:bookmarkStart w:id="17" w:name="cómo-se-califica"/>
-      <w:bookmarkEnd w:id="16"/>
-      <w:r>
-        <w:t>Cómo se califica</w:t>
-      </w:r>
-    </w:p>
-    <w:tbl>
-      <w:tblPr>
-        <w:tblStyle w:val="Table"/>
-        <w:tblW w:w="5000" w:type="pct"/>
-        <w:tblLayout w:type="fixed"/>
-        <w:tblLook w:val="0020" w:firstRow="1" w:lastRow="0" w:firstColumn="0" w:lastColumn="0" w:noHBand="0" w:noVBand="0"/>
-      </w:tblPr>
-      <w:tblGrid>
-        <w:gridCol w:w="4785"/>
-        <w:gridCol w:w="4785"/>
-      </w:tblGrid>
-      <w:tr>
-        <w:trPr>
-          <w:cnfStyle w:val="100000000000" w:firstRow="1" w:lastRow="0" w:firstColumn="0" w:lastColumn="0" w:oddVBand="0" w:evenVBand="0" w:oddHBand="0" w:evenHBand="0" w:firstRowFirstColumn="0" w:firstRowLastColumn="0" w:lastRowFirstColumn="0" w:lastRowLastColumn="0"/>
-          <w:tblHeader/>
-        </w:trPr>
-        <w:tc>
-          <w:tcPr>
-            <w:tcW w:w="3960" w:type="dxa"/>
-          </w:tcPr>
-          <w:p>
-            <w:pPr>
-              <w:pStyle w:val="Compact"/>
-            </w:pPr>
-            <w:r>
-              <w:t>Qué</w:t>
-            </w:r>
-          </w:p>
-        </w:tc>
-        <w:tc>
-          <w:tcPr>
-            <w:tcW w:w="3960" w:type="dxa"/>
-          </w:tcPr>
-          <w:p>
-            <w:pPr>
-              <w:pStyle w:val="Compact"/>
-            </w:pPr>
-            <w:r>
-              <w:t>Puntos</w:t>
-            </w:r>
-          </w:p>
-        </w:tc>
-      </w:tr>
-      <w:tr>
-        <w:tc>
-          <w:tcPr>
-            <w:tcW w:w="3960" w:type="dxa"/>
-          </w:tcPr>
-          <w:p>
-            <w:pPr>
-              <w:pStyle w:val="Compact"/>
-            </w:pPr>
-            <w:r>
-              <w:t xml:space="preserve">P1, P2, P3 y P6 · resultado correcto y </w:t>
-            </w:r>
-            <w:r>
-              <w:lastRenderedPageBreak/>
-              <w:t>¿Cumple? bien marcado</w:t>
-            </w:r>
-          </w:p>
-        </w:tc>
-        <w:tc>
-          <w:tcPr>
-            <w:tcW w:w="3960" w:type="dxa"/>
-          </w:tcPr>
-          <w:p>
-            <w:pPr>
-              <w:pStyle w:val="Compact"/>
-            </w:pPr>
-            <w:r>
-              <w:lastRenderedPageBreak/>
-              <w:t>1 cada uno, 4 en total</w:t>
-            </w:r>
-          </w:p>
-        </w:tc>
-      </w:tr>
-      <w:tr>
-        <w:tc>
-          <w:tcPr>
-            <w:tcW w:w="3960" w:type="dxa"/>
-          </w:tcPr>
-          <w:p>
-            <w:pPr>
-              <w:pStyle w:val="Compact"/>
-            </w:pPr>
-            <w:r>
-              <w:t>P4 · las dos cifras de cesados y las dos de cuentas sin responsable</w:t>
-            </w:r>
-          </w:p>
-        </w:tc>
-        <w:tc>
-          <w:tcPr>
-            <w:tcW w:w="3960" w:type="dxa"/>
-          </w:tcPr>
-          <w:p>
-            <w:pPr>
-              <w:pStyle w:val="Compact"/>
-            </w:pPr>
-            <w:r>
-              <w:t>2</w:t>
-            </w:r>
-          </w:p>
-        </w:tc>
-      </w:tr>
-      <w:tr>
-        <w:tc>
-          <w:tcPr>
-            <w:tcW w:w="3960" w:type="dxa"/>
-          </w:tcPr>
-          <w:p>
-            <w:pPr>
-              <w:pStyle w:val="Compact"/>
-            </w:pPr>
-            <w:r>
-              <w:t>P5 · condición SQL correcta, con casos, monto y usuarios</w:t>
-            </w:r>
-          </w:p>
-        </w:tc>
-        <w:tc>
-          <w:tcPr>
-            <w:tcW w:w="3960" w:type="dxa"/>
-          </w:tcPr>
-          <w:p>
-            <w:pPr>
-              <w:pStyle w:val="Compact"/>
-            </w:pPr>
-            <w:r>
-              <w:t>2</w:t>
-            </w:r>
-          </w:p>
-        </w:tc>
-      </w:tr>
-      <w:tr>
-        <w:tc>
-          <w:tcPr>
-            <w:tcW w:w="3960" w:type="dxa"/>
-          </w:tcPr>
-          <w:p>
-            <w:pPr>
-              <w:pStyle w:val="Compact"/>
-            </w:pPr>
-            <w:r>
-              <w:t>P7 · restauración ejecutada, tabla faltante y días sin respaldo</w:t>
-            </w:r>
-          </w:p>
-        </w:tc>
-        <w:tc>
-          <w:tcPr>
-            <w:tcW w:w="3960" w:type="dxa"/>
-          </w:tcPr>
-          <w:p>
-            <w:pPr>
-              <w:pStyle w:val="Compact"/>
-            </w:pPr>
-            <w:r>
-              <w:t>2</w:t>
-            </w:r>
-          </w:p>
-        </w:tc>
-      </w:tr>
-      <w:tr>
-        <w:tc>
-          <w:tcPr>
-            <w:tcW w:w="3960" w:type="dxa"/>
-          </w:tcPr>
-          <w:p>
-            <w:pPr>
-              <w:pStyle w:val="Compact"/>
-            </w:pPr>
-            <w:r>
-              <w:t>Hallazgo 1 · condición con cifras, criterio con código, causa con evidencia, efecto y recomendación</w:t>
-            </w:r>
-          </w:p>
-        </w:tc>
-        <w:tc>
-          <w:tcPr>
-            <w:tcW w:w="3960" w:type="dxa"/>
-          </w:tcPr>
-          <w:p>
-            <w:pPr>
-              <w:pStyle w:val="Compact"/>
-            </w:pPr>
-            <w:r>
-              <w:t>4</w:t>
-            </w:r>
-          </w:p>
-        </w:tc>
-      </w:tr>
-      <w:tr>
-        <w:tc>
-          <w:tcPr>
-            <w:tcW w:w="3960" w:type="dxa"/>
-          </w:tcPr>
-          <w:p>
-            <w:pPr>
-              <w:pStyle w:val="Compact"/>
-            </w:pPr>
-            <w:r>
-              <w:t>Hallazgo 2 · lo mismo</w:t>
-            </w:r>
-          </w:p>
-        </w:tc>
-        <w:tc>
-          <w:tcPr>
-            <w:tcW w:w="3960" w:type="dxa"/>
-          </w:tcPr>
-          <w:p>
-            <w:pPr>
-              <w:pStyle w:val="Compact"/>
-            </w:pPr>
-            <w:r>
-              <w:t>4</w:t>
-            </w:r>
-          </w:p>
-        </w:tc>
-      </w:tr>
-      <w:tr>
-        <w:tc>
-          <w:tcPr>
-            <w:tcW w:w="3960" w:type="dxa"/>
-          </w:tcPr>
-          <w:p>
-            <w:pPr>
-              <w:pStyle w:val="Compact"/>
-            </w:pPr>
-            <w:r>
-              <w:t xml:space="preserve">Repositorio con la etiqueta, las evidencias y </w:t>
-            </w:r>
-            <w:r>
-              <w:rPr>
-                <w:rStyle w:val="VerbatimChar"/>
-              </w:rPr>
-              <w:t>SHA256SUMS.txt</w:t>
-            </w:r>
-          </w:p>
-        </w:tc>
-        <w:tc>
-          <w:tcPr>
-            <w:tcW w:w="3960" w:type="dxa"/>
-          </w:tcPr>
-          <w:p>
-            <w:pPr>
-              <w:pStyle w:val="Compact"/>
-            </w:pPr>
-            <w:r>
-              <w:t>2</w:t>
-            </w:r>
-          </w:p>
-        </w:tc>
-      </w:tr>
-      <w:tr>
-        <w:tc>
-          <w:tcPr>
-            <w:tcW w:w="3960" w:type="dxa"/>
-          </w:tcPr>
-          <w:p>
-            <w:pPr>
-              <w:pStyle w:val="Compact"/>
-            </w:pPr>
-            <w:r>
-              <w:rPr>
-                <w:b/>
-                <w:bCs/>
-              </w:rPr>
-              <w:t>Total</w:t>
-            </w:r>
-          </w:p>
-        </w:tc>
-        <w:tc>
-          <w:tcPr>
-            <w:tcW w:w="3960" w:type="dxa"/>
-          </w:tcPr>
-          <w:p>
-            <w:pPr>
-              <w:pStyle w:val="Compact"/>
-            </w:pPr>
-            <w:r>
               <w:rPr>
                 <w:b/>
                 <w:bCs/>
@@ -5577,8 +6541,8 @@
       </w:pPr>
     </w:p>
     <w:sectPr>
-      <w:headerReference w:type="default" r:id="rId10"/>
-      <w:footerReference w:type="default" r:id="rId11"/>
+      <w:headerReference w:type="default" r:id="rId30"/>
+      <w:footerReference w:type="default" r:id="rId31"/>
       <w:footnotePr>
         <w:numRestart w:val="eachSect"/>
       </w:footnotePr>
@@ -8828,6 +9792,26 @@
       <w:shd w:val="clear" w:color="auto" w:fill="E1DFDD"/>
     </w:rPr>
   </w:style>
+  <w:style w:type="paragraph" w:styleId="Prrafodelista">
+    <w:name w:val="List Paragraph"/>
+    <w:basedOn w:val="Normal"/>
+    <w:rsid w:val="00130A99"/>
+    <w:pPr>
+      <w:ind w:left="720"/>
+      <w:contextualSpacing/>
+    </w:pPr>
+  </w:style>
+  <w:style w:type="character" w:styleId="Hipervnculovisitado">
+    <w:name w:val="FollowedHyperlink"/>
+    <w:basedOn w:val="Fuentedeprrafopredeter"/>
+    <w:semiHidden/>
+    <w:unhideWhenUsed/>
+    <w:rsid w:val="00A040C5"/>
+    <w:rPr>
+      <w:color w:val="96607D" w:themeColor="followedHyperlink"/>
+      <w:u w:val="single"/>
+    </w:rPr>
+  </w:style>
 </w:styles>
 </file>
 
@@ -9131,7 +10115,7 @@
 </file>
 
 <file path=customXml/itemProps1.xml><?xml version="1.0" encoding="utf-8"?>
-<ds:datastoreItem xmlns:ds="http://schemas.openxmlformats.org/officeDocument/2006/customXml" ds:itemID="{D8ECB91E-65F1-49A4-8DBF-22B3DF485683}">
+<ds:datastoreItem xmlns:ds="http://schemas.openxmlformats.org/officeDocument/2006/customXml" ds:itemID="{1477BB0F-F694-4367-9751-FF6E92AB38DB}">
   <ds:schemaRefs>
     <ds:schemaRef ds:uri="http://schemas.openxmlformats.org/officeDocument/2006/bibliography"/>
   </ds:schemaRefs>

</xml_diff>